<commit_message>
Condense research paper to 22 pages and separate simulation supplement
</commit_message>
<xml_diff>
--- a/research/ProgIoT DA-7 Research Paper Rishit 23BCT0157.docx
+++ b/research/ProgIoT DA-7 Research Paper Rishit 23BCT0157.docx
@@ -1719,7 +1719,7 @@
           <w:sz w:val="22"/>
           <w:szCs w:val="22"/>
         </w:rPr>
-        <w:t>The architecture comprises an ESP32 sensing design, an MQTT collector and a Streamlit application, evaluated through two complementary simulation paths. The browser engine runs in Python and renders calculated state; Wokwi compiles and executes the Arduino ESP32 firmware against virtual circuit components. Figure 3 shows a physical DHT11/capacitive-probe assembly that did not supply the reported results. Figure 4 shows the tested Wokwi DHT22/potentiometer configuration. Both simulations use a five-second sample period and a five-sample moving average. The LED and GPIO output represent a pump command without hydraulic feedback.</w:t>
+        <w:t>The architecture comprises an ESP32 sensing design, an MQTT collector and a Streamlit application, evaluated through two complementary simulation paths. The browser engine runs in Python and renders calculated state; Wokwi compiles and executes the Arduino ESP32 firmware against virtual circuit components. A physical DHT11/capacitive-probe assembly was built but did not supply the reported results. Figure 3 shows the tested Wokwi DHT22/potentiometer configuration. Both simulations use a five-second sample period and a five-sample moving average. The LED and GPIO output represent a pump command without hydraulic feedback.</w:t>
       </w:r>
     </w:p>
     <w:p>
@@ -2339,20 +2339,11 @@
             <w:tcW w:w="2304" w:type="dxa"/>
           </w:tcPr>
           <w:p>
-            <w:pPr>
-              <w:keepNext/>
-              <w:spacing w:after="60" w:before="60"/>
-              <w:jc w:val="center"/>
-              <w:rPr>
-                <w:color w:val="000000" w:themeColor="text1"/>
-              </w:rPr>
-            </w:pPr>
-            <w:r>
-              <w:rPr>
-                <w:color w:val="000000" w:themeColor="text1"/>
-                <w:sz w:val="18"/>
-              </w:rPr>
-              <w:t>I²C in Figure 4</w:t>
+            <w:r>
+              <w:rPr>
+                <w:sz w:val="18"/>
+              </w:rPr>
+              <w:t>I²C in Figure 3</w:t>
             </w:r>
           </w:p>
         </w:tc>
@@ -2586,97 +2577,6 @@
           <w:szCs w:val="22"/>
         </w:rPr>
         <w:t>The tested Wokwi circuit uses an SSD1306 I2C display at address 0x3C, with SDA GPIO 21 and SCL GPIO 22, consistent with the documented interface [11]. Its four project files are sketch.ino, controller.h, diagram.json and libraries.txt. The sketch compiled and ran successfully in Wokwi; a fresh project view after saving matched the tested sketch and diagram. OLED refresh can appear dithered in paused screenshots, so numerical decisions are reported using Serial and archived telemetry.</w:t>
-      </w:r>
-    </w:p>
-    <w:p>
-      <w:pPr>
-        <w:keepNext/>
-        <w:widowControl/>
-        <w:spacing w:after="160" w:line="276" w:lineRule="auto"/>
-        <w:jc w:val="center"/>
-        <w:rPr>
-          <w:color w:val="000000" w:themeColor="text1"/>
-        </w:rPr>
-      </w:pPr>
-      <w:r>
-        <w:rPr>
-          <w:noProof/>
-        </w:rPr>
-        <w:lastRenderedPageBreak/>
-        <w:drawing>
-          <wp:inline distT="0" distB="0" distL="0" distR="0" wp14:anchorId="44C8D76B" wp14:editId="7CF55522">
-            <wp:extent cx="4023360" cy="4622481"/>
-            <wp:effectExtent l="0" t="0" r="0" b="0"/>
-            <wp:docPr id="895964509" name="Picture 15">
-              <a:extLst xmlns:a="http://schemas.openxmlformats.org/drawingml/2006/main">
-                <a:ext uri="{FF2B5EF4-FFF2-40B4-BE49-F238E27FC236}">
-                  <a16:creationId xmlns:a16="http://schemas.microsoft.com/office/drawing/2014/main" id="{F91CEF13-64AC-B614-37CF-1EDAF954BF3D}"/>
-                </a:ext>
-              </a:extLst>
-            </wp:docPr>
-            <wp:cNvGraphicFramePr>
-              <a:graphicFrameLocks xmlns:a="http://schemas.openxmlformats.org/drawingml/2006/main" noChangeAspect="1"/>
-            </wp:cNvGraphicFramePr>
-            <a:graphic xmlns:a="http://schemas.openxmlformats.org/drawingml/2006/main">
-              <a:graphicData uri="http://schemas.openxmlformats.org/drawingml/2006/picture">
-                <pic:pic xmlns:pic="http://schemas.openxmlformats.org/drawingml/2006/picture">
-                  <pic:nvPicPr>
-                    <pic:cNvPr id="16" name="Picture 15">
-                      <a:extLst>
-                        <a:ext uri="{FF2B5EF4-FFF2-40B4-BE49-F238E27FC236}">
-                          <a16:creationId xmlns:a16="http://schemas.microsoft.com/office/drawing/2014/main" id="{F91CEF13-64AC-B614-37CF-1EDAF954BF3D}"/>
-                        </a:ext>
-                      </a:extLst>
-                    </pic:cNvPr>
-                    <pic:cNvPicPr>
-                      <a:picLocks noChangeAspect="1"/>
-                    </pic:cNvPicPr>
-                  </pic:nvPicPr>
-                  <pic:blipFill>
-                    <a:blip r:embed="rId7"/>
-                    <a:stretch>
-                      <a:fillRect/>
-                    </a:stretch>
-                  </pic:blipFill>
-                  <pic:spPr>
-                    <a:xfrm>
-                      <a:off x="0" y="0"/>
-                      <a:ext cx="4023360" cy="4622481"/>
-                    </a:xfrm>
-                    <a:prstGeom prst="rect">
-                      <a:avLst/>
-                    </a:prstGeom>
-                  </pic:spPr>
-                </pic:pic>
-              </a:graphicData>
-            </a:graphic>
-          </wp:inline>
-        </w:drawing>
-      </w:r>
-    </w:p>
-    <w:p>
-      <w:pPr>
-        <w:keepNext w:val="0"/>
-        <w:widowControl/>
-        <w:spacing w:after="160" w:line="276" w:lineRule="auto"/>
-        <w:jc w:val="center"/>
-        <w:rPr>
-          <w:i/>
-          <w:iCs/>
-          <w:color w:val="000000" w:themeColor="text1"/>
-          <w:sz w:val="21"/>
-          <w:szCs w:val="21"/>
-        </w:rPr>
-      </w:pPr>
-      <w:r>
-        <w:rPr>
-          <w:i/>
-          <w:iCs/>
-          <w:color w:val="000000" w:themeColor="text1"/>
-          <w:sz w:val="20"/>
-          <w:szCs w:val="21"/>
-        </w:rPr>
-        <w:t>Figure 3: Physical DHT11 Breadboard Assembly Not Used for the Reported Test Cases</w:t>
       </w:r>
     </w:p>
     <w:p>
@@ -5656,7 +5556,7 @@
           <w:sz w:val="22"/>
           <w:szCs w:val="22"/>
         </w:rPr>
-        <w:t>Two experiments are distinguished. The browser experiment executes nine deterministic scenarios, each for 120 software seconds with seed 7, five-second samples and one-second state/fault ticks. Wokwi executes 18 prescribed functional scenarios through the saved ESP32 firmware [16]. CASE commands reset the filter and pending dose; STEP preserves existing filter and dose history. The original firmware suite shares one boot, with later TC18 framing repeats counted once. The LIVE demonstration reads the Wokwi sensor models. These are functional observations, not independent field replications. Browser screenshots are in Figures 5–15; Figure 4 and Figures 16–34 preserve Wokwi circuit-and-Serial views.</w:t>
+        <w:t>Two experiments are distinguished. The browser experiment executes nine deterministic scenarios, each for 120 software seconds with seed 7, five-second samples and one-second state/fault ticks. Wokwi executes 18 prescribed functional scenarios through the saved ESP32 firmware [16]. CASE commands reset the filter and pending dose; STEP preserves existing filter and dose history. The original firmware suite shares one boot, with later TC18 framing repeats counted once. The LIVE demonstration reads the Wokwi sensor models. These are functional observations, not independent field replications. Figure 3 shows a representative Wokwi circuit-and-Serial state; Appendix B retains two browser views. The companion supplementary document provides the complete screenshot evidence and per-case reproduction commands.</w:t>
       </w:r>
     </w:p>
     <w:p>
@@ -5726,7 +5626,7 @@
           <w:sz w:val="20"/>
           <w:szCs w:val="21"/>
         </w:rPr>
-        <w:t>Figure 4: Tested Wokwi Circuit and Serial Monitor at Normal Input with an 8-Minute Command and GPIO2 HIGH</w:t>
+        <w:t>Figure 3: Tested Wokwi Circuit and Serial Monitor at Normal Input with an 8-Minute Command and GPIO2 HIGH</w:t>
       </w:r>
     </w:p>
     <w:p>
@@ -5955,17 +5855,11 @@
             </w:tcMar>
           </w:tcPr>
           <w:p>
-            <w:pPr>
-              <w:keepNext w:val="0"/>
-              <w:spacing w:after="60" w:before="60" w:line="240" w:lineRule="auto"/>
-            </w:pPr>
-            <w:r>
-              <w:rPr>
-                <w:b/>
-                <w:color w:val="000000"/>
-                <w:sz w:val="18"/>
-              </w:rPr>
-              <w:t>Figure</w:t>
+            <w:r>
+              <w:rPr>
+                <w:sz w:val="18"/>
+              </w:rPr>
+              <w:t>Evidence</w:t>
             </w:r>
           </w:p>
         </w:tc>
@@ -6127,17 +6021,11 @@
             </w:tcMar>
           </w:tcPr>
           <w:p>
-            <w:pPr>
-              <w:keepNext w:val="0"/>
-              <w:spacing w:after="60" w:before="60" w:line="240" w:lineRule="auto"/>
-            </w:pPr>
-            <w:r>
-              <w:rPr>
-                <w:b w:val="0"/>
-                <w:color w:val="000000"/>
-                <w:sz w:val="18"/>
-              </w:rPr>
-              <w:t>5</w:t>
+            <w:r>
+              <w:rPr>
+                <w:sz w:val="18"/>
+              </w:rPr>
+              <w:t>S-B01</w:t>
             </w:r>
           </w:p>
         </w:tc>
@@ -6299,17 +6187,11 @@
             </w:tcMar>
           </w:tcPr>
           <w:p>
-            <w:pPr>
-              <w:keepNext w:val="0"/>
-              <w:spacing w:after="60" w:before="60" w:line="240" w:lineRule="auto"/>
-            </w:pPr>
-            <w:r>
-              <w:rPr>
-                <w:b w:val="0"/>
-                <w:color w:val="000000"/>
-                <w:sz w:val="18"/>
-              </w:rPr>
-              <w:t>6</w:t>
+            <w:r>
+              <w:rPr>
+                <w:sz w:val="18"/>
+              </w:rPr>
+              <w:t>S-B02</w:t>
             </w:r>
           </w:p>
         </w:tc>
@@ -6471,17 +6353,11 @@
             </w:tcMar>
           </w:tcPr>
           <w:p>
-            <w:pPr>
-              <w:keepNext w:val="0"/>
-              <w:spacing w:after="60" w:before="60" w:line="240" w:lineRule="auto"/>
-            </w:pPr>
-            <w:r>
-              <w:rPr>
-                <w:b w:val="0"/>
-                <w:color w:val="000000"/>
-                <w:sz w:val="18"/>
-              </w:rPr>
-              <w:t>7</w:t>
+            <w:r>
+              <w:rPr>
+                <w:sz w:val="18"/>
+              </w:rPr>
+              <w:t>S-B03</w:t>
             </w:r>
           </w:p>
         </w:tc>
@@ -6643,17 +6519,11 @@
             </w:tcMar>
           </w:tcPr>
           <w:p>
-            <w:pPr>
-              <w:keepNext w:val="0"/>
-              <w:spacing w:after="60" w:before="60" w:line="240" w:lineRule="auto"/>
-            </w:pPr>
-            <w:r>
-              <w:rPr>
-                <w:b w:val="0"/>
-                <w:color w:val="000000"/>
-                <w:sz w:val="18"/>
-              </w:rPr>
-              <w:t>8</w:t>
+            <w:r>
+              <w:rPr>
+                <w:sz w:val="18"/>
+              </w:rPr>
+              <w:t>S-B04</w:t>
             </w:r>
           </w:p>
         </w:tc>
@@ -6815,17 +6685,11 @@
             </w:tcMar>
           </w:tcPr>
           <w:p>
-            <w:pPr>
-              <w:keepNext w:val="0"/>
-              <w:spacing w:after="60" w:before="60" w:line="240" w:lineRule="auto"/>
-            </w:pPr>
-            <w:r>
-              <w:rPr>
-                <w:b w:val="0"/>
-                <w:color w:val="000000"/>
-                <w:sz w:val="18"/>
-              </w:rPr>
-              <w:t>9</w:t>
+            <w:r>
+              <w:rPr>
+                <w:sz w:val="18"/>
+              </w:rPr>
+              <w:t>S-B05</w:t>
             </w:r>
           </w:p>
         </w:tc>
@@ -6987,17 +6851,11 @@
             </w:tcMar>
           </w:tcPr>
           <w:p>
-            <w:pPr>
-              <w:keepNext w:val="0"/>
-              <w:spacing w:after="60" w:before="60" w:line="240" w:lineRule="auto"/>
-            </w:pPr>
-            <w:r>
-              <w:rPr>
-                <w:b w:val="0"/>
-                <w:color w:val="000000"/>
-                <w:sz w:val="18"/>
-              </w:rPr>
-              <w:t>10</w:t>
+            <w:r>
+              <w:rPr>
+                <w:sz w:val="18"/>
+              </w:rPr>
+              <w:t>S-B06</w:t>
             </w:r>
           </w:p>
         </w:tc>
@@ -7159,17 +7017,11 @@
             </w:tcMar>
           </w:tcPr>
           <w:p>
-            <w:pPr>
-              <w:keepNext w:val="0"/>
-              <w:spacing w:after="60" w:before="60" w:line="240" w:lineRule="auto"/>
-            </w:pPr>
-            <w:r>
-              <w:rPr>
-                <w:b w:val="0"/>
-                <w:color w:val="000000"/>
-                <w:sz w:val="18"/>
-              </w:rPr>
-              <w:t>11</w:t>
+            <w:r>
+              <w:rPr>
+                <w:sz w:val="18"/>
+              </w:rPr>
+              <w:t>S-B07</w:t>
             </w:r>
           </w:p>
         </w:tc>
@@ -7331,17 +7183,11 @@
             </w:tcMar>
           </w:tcPr>
           <w:p>
-            <w:pPr>
-              <w:keepNext w:val="0"/>
-              <w:spacing w:after="60" w:before="60" w:line="240" w:lineRule="auto"/>
-            </w:pPr>
-            <w:r>
-              <w:rPr>
-                <w:b w:val="0"/>
-                <w:color w:val="000000"/>
-                <w:sz w:val="18"/>
-              </w:rPr>
-              <w:t>12</w:t>
+            <w:r>
+              <w:rPr>
+                <w:sz w:val="18"/>
+              </w:rPr>
+              <w:t>S-B08</w:t>
             </w:r>
           </w:p>
         </w:tc>
@@ -7503,17 +7349,11 @@
             </w:tcMar>
           </w:tcPr>
           <w:p>
-            <w:pPr>
-              <w:keepNext w:val="0"/>
-              <w:spacing w:after="60" w:before="60" w:line="240" w:lineRule="auto"/>
-            </w:pPr>
-            <w:r>
-              <w:rPr>
-                <w:b w:val="0"/>
-                <w:color w:val="000000"/>
-                <w:sz w:val="18"/>
-              </w:rPr>
-              <w:t>13</w:t>
+            <w:r>
+              <w:rPr>
+                <w:sz w:val="18"/>
+              </w:rPr>
+              <w:t>S-B09</w:t>
             </w:r>
           </w:p>
         </w:tc>
@@ -7536,7 +7376,7 @@
           <w:sz w:val="22"/>
           <w:szCs w:val="22"/>
         </w:rPr>
-        <w:t>Table 6 records the browser conditions and selected states, with identical observations driving both policies. Table 6a separately records all 18 Wokwi conditions. Browser IDs TC-01–TC-09 and paper firmware IDs W-01–W-18 belong to different experiments; firmware Serial labels TC01–TC18 map directly to W-01–W-18. These source-defined outputs replace the undocumented legacy 8.1- and 38.7-minute values.</w:t>
+        <w:t>Table 6 records the browser conditions and selected states, with identical observations driving both policies. Table 6a separately records all 18 Wokwi conditions. Browser IDs TC-01–TC-09 and paper firmware IDs W-01–W-18 belong to different experiments; firmware Serial labels TC01–TC18 map directly to W-01–W-18.</w:t>
       </w:r>
     </w:p>
     <w:p>
@@ -7683,7 +7523,7 @@
           <w:b w:val="0"/>
           <w:sz w:val="20"/>
         </w:rPr>
-        <w:t>Table 6a uses M/T/RH in percent/°C/percent. All cases passed against source-defined expectations. An 8-minute command is an 8-second accelerated dose, not eight measured irrigation minutes. Commands separated by a semicolon below are entered sequentially in Serial. A complete case record is required before evaluation; STATUS reports existing state rather than taking a fresh sample.</w:t>
+        <w:t>Table 6a uses M/T/RH in percent/°C/percent. All cases passed against source-defined expectations. An 8-minute command is an 8-second accelerated dose, not eight measured irrigation minutes. Supplementary case IDs S-W01–S-W18 identify the corresponding commands, circuit-and-Serial captures and raw records in the companion document.</w:t>
       </w:r>
     </w:p>
     <w:p>
@@ -7965,16 +7805,11 @@
             </w:tcMar>
           </w:tcPr>
           <w:p>
-            <w:pPr>
-              <w:spacing w:after="40" w:before="40" w:line="240" w:lineRule="auto"/>
-            </w:pPr>
-            <w:r>
-              <w:rPr>
-                <w:b w:val="0"/>
-                <w:color w:val="000000"/>
-                <w:sz w:val="18"/>
-              </w:rPr>
-              <w:t>PASS; Fig. 4</w:t>
+            <w:r>
+              <w:rPr>
+                <w:sz w:val="18"/>
+              </w:rPr>
+              <w:t>PASS; S-W01</w:t>
             </w:r>
           </w:p>
         </w:tc>
@@ -8098,16 +7933,11 @@
             </w:tcMar>
           </w:tcPr>
           <w:p>
-            <w:pPr>
-              <w:spacing w:after="40" w:before="40" w:line="240" w:lineRule="auto"/>
-            </w:pPr>
-            <w:r>
-              <w:rPr>
-                <w:b w:val="0"/>
-                <w:color w:val="000000"/>
-                <w:sz w:val="18"/>
-              </w:rPr>
-              <w:t>PASS; Fig. 16</w:t>
+            <w:r>
+              <w:rPr>
+                <w:sz w:val="18"/>
+              </w:rPr>
+              <w:t>PASS; S-W02</w:t>
             </w:r>
           </w:p>
         </w:tc>
@@ -8231,16 +8061,11 @@
             </w:tcMar>
           </w:tcPr>
           <w:p>
-            <w:pPr>
-              <w:spacing w:after="40" w:before="40" w:line="240" w:lineRule="auto"/>
-            </w:pPr>
-            <w:r>
-              <w:rPr>
-                <w:b w:val="0"/>
-                <w:color w:val="000000"/>
-                <w:sz w:val="18"/>
-              </w:rPr>
-              <w:t>PASS; Fig. 17</w:t>
+            <w:r>
+              <w:rPr>
+                <w:sz w:val="18"/>
+              </w:rPr>
+              <w:t>PASS; S-W03</w:t>
             </w:r>
           </w:p>
         </w:tc>
@@ -8364,16 +8189,11 @@
             </w:tcMar>
           </w:tcPr>
           <w:p>
-            <w:pPr>
-              <w:spacing w:after="40" w:before="40" w:line="240" w:lineRule="auto"/>
-            </w:pPr>
-            <w:r>
-              <w:rPr>
-                <w:b w:val="0"/>
-                <w:color w:val="000000"/>
-                <w:sz w:val="18"/>
-              </w:rPr>
-              <w:t>PASS; Fig. 18</w:t>
+            <w:r>
+              <w:rPr>
+                <w:sz w:val="18"/>
+              </w:rPr>
+              <w:t>PASS; S-W04</w:t>
             </w:r>
           </w:p>
         </w:tc>
@@ -8497,16 +8317,11 @@
             </w:tcMar>
           </w:tcPr>
           <w:p>
-            <w:pPr>
-              <w:spacing w:after="40" w:before="40" w:line="240" w:lineRule="auto"/>
-            </w:pPr>
-            <w:r>
-              <w:rPr>
-                <w:b w:val="0"/>
-                <w:color w:val="000000"/>
-                <w:sz w:val="18"/>
-              </w:rPr>
-              <w:t>PASS; Fig. 19</w:t>
+            <w:r>
+              <w:rPr>
+                <w:sz w:val="18"/>
+              </w:rPr>
+              <w:t>PASS; S-W05</w:t>
             </w:r>
           </w:p>
         </w:tc>
@@ -8630,16 +8445,11 @@
             </w:tcMar>
           </w:tcPr>
           <w:p>
-            <w:pPr>
-              <w:spacing w:after="40" w:before="40" w:line="240" w:lineRule="auto"/>
-            </w:pPr>
-            <w:r>
-              <w:rPr>
-                <w:b w:val="0"/>
-                <w:color w:val="000000"/>
-                <w:sz w:val="18"/>
-              </w:rPr>
-              <w:t>PASS; Fig. 20</w:t>
+            <w:r>
+              <w:rPr>
+                <w:sz w:val="18"/>
+              </w:rPr>
+              <w:t>PASS; S-W06</w:t>
             </w:r>
           </w:p>
         </w:tc>
@@ -8763,16 +8573,11 @@
             </w:tcMar>
           </w:tcPr>
           <w:p>
-            <w:pPr>
-              <w:spacing w:after="40" w:before="40" w:line="240" w:lineRule="auto"/>
-            </w:pPr>
-            <w:r>
-              <w:rPr>
-                <w:b w:val="0"/>
-                <w:color w:val="000000"/>
-                <w:sz w:val="18"/>
-              </w:rPr>
-              <w:t>PASS; Fig. 21</w:t>
+            <w:r>
+              <w:rPr>
+                <w:sz w:val="18"/>
+              </w:rPr>
+              <w:t>PASS; S-W07</w:t>
             </w:r>
           </w:p>
         </w:tc>
@@ -8896,16 +8701,11 @@
             </w:tcMar>
           </w:tcPr>
           <w:p>
-            <w:pPr>
-              <w:spacing w:after="40" w:before="40" w:line="240" w:lineRule="auto"/>
-            </w:pPr>
-            <w:r>
-              <w:rPr>
-                <w:b w:val="0"/>
-                <w:color w:val="000000"/>
-                <w:sz w:val="18"/>
-              </w:rPr>
-              <w:t>PASS; Fig. 22</w:t>
+            <w:r>
+              <w:rPr>
+                <w:sz w:val="18"/>
+              </w:rPr>
+              <w:t>PASS; S-W08</w:t>
             </w:r>
           </w:p>
         </w:tc>
@@ -9029,16 +8829,11 @@
             </w:tcMar>
           </w:tcPr>
           <w:p>
-            <w:pPr>
-              <w:spacing w:after="40" w:before="40" w:line="240" w:lineRule="auto"/>
-            </w:pPr>
-            <w:r>
-              <w:rPr>
-                <w:b w:val="0"/>
-                <w:color w:val="000000"/>
-                <w:sz w:val="18"/>
-              </w:rPr>
-              <w:t>PASS; Fig. 23</w:t>
+            <w:r>
+              <w:rPr>
+                <w:sz w:val="18"/>
+              </w:rPr>
+              <w:t>PASS; S-W09</w:t>
             </w:r>
           </w:p>
         </w:tc>
@@ -9162,16 +8957,11 @@
             </w:tcMar>
           </w:tcPr>
           <w:p>
-            <w:pPr>
-              <w:spacing w:after="40" w:before="40" w:line="240" w:lineRule="auto"/>
-            </w:pPr>
-            <w:r>
-              <w:rPr>
-                <w:b w:val="0"/>
-                <w:color w:val="000000"/>
-                <w:sz w:val="18"/>
-              </w:rPr>
-              <w:t>PASS; Fig. 24</w:t>
+            <w:r>
+              <w:rPr>
+                <w:sz w:val="18"/>
+              </w:rPr>
+              <w:t>PASS; S-W10</w:t>
             </w:r>
           </w:p>
         </w:tc>
@@ -9295,16 +9085,11 @@
             </w:tcMar>
           </w:tcPr>
           <w:p>
-            <w:pPr>
-              <w:spacing w:after="40" w:before="40" w:line="240" w:lineRule="auto"/>
-            </w:pPr>
-            <w:r>
-              <w:rPr>
-                <w:b w:val="0"/>
-                <w:color w:val="000000"/>
-                <w:sz w:val="18"/>
-              </w:rPr>
-              <w:t>PASS; Fig. 25</w:t>
+            <w:r>
+              <w:rPr>
+                <w:sz w:val="18"/>
+              </w:rPr>
+              <w:t>PASS; S-W11</w:t>
             </w:r>
           </w:p>
         </w:tc>
@@ -9428,16 +9213,11 @@
             </w:tcMar>
           </w:tcPr>
           <w:p>
-            <w:pPr>
-              <w:spacing w:after="40" w:before="40" w:line="240" w:lineRule="auto"/>
-            </w:pPr>
-            <w:r>
-              <w:rPr>
-                <w:b w:val="0"/>
-                <w:color w:val="000000"/>
-                <w:sz w:val="18"/>
-              </w:rPr>
-              <w:t>PASS; Fig. 26</w:t>
+            <w:r>
+              <w:rPr>
+                <w:sz w:val="18"/>
+              </w:rPr>
+              <w:t>PASS; S-W12</w:t>
             </w:r>
           </w:p>
         </w:tc>
@@ -9561,16 +9341,11 @@
             </w:tcMar>
           </w:tcPr>
           <w:p>
-            <w:pPr>
-              <w:spacing w:after="40" w:before="40" w:line="240" w:lineRule="auto"/>
-            </w:pPr>
-            <w:r>
-              <w:rPr>
-                <w:b w:val="0"/>
-                <w:color w:val="000000"/>
-                <w:sz w:val="18"/>
-              </w:rPr>
-              <w:t>PASS; Fig. 27</w:t>
+            <w:r>
+              <w:rPr>
+                <w:sz w:val="18"/>
+              </w:rPr>
+              <w:t>PASS; S-W13</w:t>
             </w:r>
           </w:p>
         </w:tc>
@@ -9694,16 +9469,11 @@
             </w:tcMar>
           </w:tcPr>
           <w:p>
-            <w:pPr>
-              <w:spacing w:after="40" w:before="40" w:line="240" w:lineRule="auto"/>
-            </w:pPr>
-            <w:r>
-              <w:rPr>
-                <w:b w:val="0"/>
-                <w:color w:val="000000"/>
-                <w:sz w:val="18"/>
-              </w:rPr>
-              <w:t>PASS; Fig. 28</w:t>
+            <w:r>
+              <w:rPr>
+                <w:sz w:val="18"/>
+              </w:rPr>
+              <w:t>PASS; S-W14</w:t>
             </w:r>
           </w:p>
         </w:tc>
@@ -9827,16 +9597,11 @@
             </w:tcMar>
           </w:tcPr>
           <w:p>
-            <w:pPr>
-              <w:spacing w:after="40" w:before="40" w:line="240" w:lineRule="auto"/>
-            </w:pPr>
-            <w:r>
-              <w:rPr>
-                <w:b w:val="0"/>
-                <w:color w:val="000000"/>
-                <w:sz w:val="18"/>
-              </w:rPr>
-              <w:t>PASS; Fig. 29</w:t>
+            <w:r>
+              <w:rPr>
+                <w:sz w:val="18"/>
+              </w:rPr>
+              <w:t>PASS; S-W15</w:t>
             </w:r>
           </w:p>
         </w:tc>
@@ -9960,16 +9725,11 @@
             </w:tcMar>
           </w:tcPr>
           <w:p>
-            <w:pPr>
-              <w:spacing w:after="40" w:before="40" w:line="240" w:lineRule="auto"/>
-            </w:pPr>
-            <w:r>
-              <w:rPr>
-                <w:b w:val="0"/>
-                <w:color w:val="000000"/>
-                <w:sz w:val="18"/>
-              </w:rPr>
-              <w:t>PASS; Fig. 30</w:t>
+            <w:r>
+              <w:rPr>
+                <w:sz w:val="18"/>
+              </w:rPr>
+              <w:t>PASS; S-W16</w:t>
             </w:r>
           </w:p>
         </w:tc>
@@ -10093,16 +9853,11 @@
             </w:tcMar>
           </w:tcPr>
           <w:p>
-            <w:pPr>
-              <w:spacing w:after="40" w:before="40" w:line="240" w:lineRule="auto"/>
-            </w:pPr>
-            <w:r>
-              <w:rPr>
-                <w:b w:val="0"/>
-                <w:color w:val="000000"/>
-                <w:sz w:val="18"/>
-              </w:rPr>
-              <w:t>PASS; Fig. 31</w:t>
+            <w:r>
+              <w:rPr>
+                <w:sz w:val="18"/>
+              </w:rPr>
+              <w:t>PASS; S-W17</w:t>
             </w:r>
           </w:p>
         </w:tc>
@@ -10226,16 +9981,11 @@
             </w:tcMar>
           </w:tcPr>
           <w:p>
-            <w:pPr>
-              <w:spacing w:after="40" w:before="40" w:line="240" w:lineRule="auto"/>
-            </w:pPr>
-            <w:r>
-              <w:rPr>
-                <w:b w:val="0"/>
-                <w:color w:val="000000"/>
-                <w:sz w:val="18"/>
-              </w:rPr>
-              <w:t>PASS; Fig. 32</w:t>
+            <w:r>
+              <w:rPr>
+                <w:sz w:val="18"/>
+              </w:rPr>
+              <w:t>PASS; S-W18</w:t>
             </w:r>
           </w:p>
         </w:tc>
@@ -15812,88 +15562,18 @@
     </w:p>
     <w:p>
       <w:pPr>
-        <w:spacing w:after="140"/>
-      </w:pPr>
-      <w:r>
-        <w:rPr>
-          <w:sz w:val="22"/>
-        </w:rPr>
-        <w:t>Figures 5–15 are captures of the evaluated browser simulator; Figure 4 and Figures 16–34 show the tested Wokwi circuit with Serial output. Sensor observations are synthetic, command minutes are accelerated at one simulation second per minute, and the output is a pump surrogate. Browser run IDs and firmware case labels identify their separate sources. Captions report selected states; complete transitions and source hashes are retained in the accompanying archives.</w:t>
+        <w:spacing w:after="100"/>
+      </w:pPr>
+      <w:r>
+        <w:t>Figures 4 and 5 illustrate a controller-policy difference and the distinction between a nonzero fuzzy command and gated pump output. Inputs are prescribed, timers are accelerated and the LED represents logical actuation. Complete browser screenshots and all Wokwi case captures are supplied in the companion supplementary document, SmartAgri Wokwi Simulation Test Cases. Tables 6 and 6a retain the full numeric case summaries in this paper.</w:t>
       </w:r>
     </w:p>
     <w:p>
       <w:pPr>
         <w:keepNext/>
-        <w:pageBreakBefore w:val="0"/>
         <w:spacing w:after="140"/>
         <w:jc w:val="center"/>
-      </w:pPr>
-      <w:r>
-        <w:drawing>
-          <wp:inline xmlns:a="http://schemas.openxmlformats.org/drawingml/2006/main" xmlns:pic="http://schemas.openxmlformats.org/drawingml/2006/picture">
-            <wp:extent cx="5943600" cy="4285053"/>
-            <wp:docPr id="1570744388" name="Picture 1570744388" descr="Normal synthetic input at 50% moisture, 27 °C and 60% RH produces an 8-minute fuzzy command and zero reference command."/>
-            <wp:cNvGraphicFramePr>
-              <a:graphicFrameLocks noChangeAspect="1"/>
-            </wp:cNvGraphicFramePr>
-            <a:graphic>
-              <a:graphicData uri="http://schemas.openxmlformats.org/drawingml/2006/picture">
-                <pic:pic>
-                  <pic:nvPicPr>
-                    <pic:cNvPr id="0" name="paper-normal.jpg"/>
-                    <pic:cNvPicPr/>
-                  </pic:nvPicPr>
-                  <pic:blipFill>
-                    <a:blip r:embed="rId13"/>
-                    <a:stretch>
-                      <a:fillRect/>
-                    </a:stretch>
-                  </pic:blipFill>
-                  <pic:spPr>
-                    <a:xfrm>
-                      <a:off x="0" y="0"/>
-                      <a:ext cx="5943600" cy="4285053"/>
-                    </a:xfrm>
-                    <a:prstGeom prst="rect"/>
-                  </pic:spPr>
-                </pic:pic>
-              </a:graphicData>
-            </a:graphic>
-          </wp:inline>
-        </w:drawing>
-      </w:r>
-    </w:p>
-    <w:p>
-      <w:pPr>
         <w:keepNext/>
-        <w:spacing w:after="140"/>
-        <w:jc w:val="left"/>
-      </w:pPr>
-      <w:r>
-        <w:rPr>
-          <w:i/>
-          <w:sz w:val="20"/>
-        </w:rPr>
-        <w:t>Figure 5: Normal synthetic input at 50% moisture, 27 °C and 60% RH produces an 8-minute fuzzy command and zero reference command.</w:t>
-      </w:r>
-    </w:p>
-    <w:p>
-      <w:pPr>
-        <w:spacing w:after="140"/>
-      </w:pPr>
-      <w:r>
-        <w:rPr>
-          <w:sz w:val="18"/>
-        </w:rPr>
-        <w:t>Replay context: 0 / 120 s. Saved run: 20261024T190126038644Z-870a58f4. Raw trace and settings accompany the paper.</w:t>
-      </w:r>
-    </w:p>
-    <w:p>
-      <w:pPr>
-        <w:keepNext/>
-        <w:pageBreakBefore/>
-        <w:spacing w:after="140"/>
-        <w:jc w:val="center"/>
       </w:pPr>
       <w:r>
         <w:drawing>
@@ -15933,168 +15613,32 @@
     <w:p>
       <w:pPr>
         <w:keepNext/>
-        <w:spacing w:after="140"/>
-        <w:jc w:val="left"/>
-      </w:pPr>
-      <w:r>
-        <w:rPr>
-          <w:i/>
-          <w:sz w:val="20"/>
-        </w:rPr>
-        <w:t>Figure 6: Dry and hot synthetic inputs produce a 40-minute fuzzy command and a 10-minute threshold-reference command.</w:t>
-      </w:r>
-    </w:p>
-    <w:p>
-      <w:pPr>
-        <w:spacing w:after="140"/>
+        <w:spacing w:after="100"/>
       </w:pPr>
       <w:r>
         <w:rPr>
           <w:sz w:val="18"/>
         </w:rPr>
+        <w:t>Figure 4: Dry and hot synthetic inputs produce a 40-minute fuzzy command and a 10-minute threshold-reference command.</w:t>
+      </w:r>
+    </w:p>
+    <w:p>
+      <w:pPr>
+        <w:spacing w:after="100"/>
+      </w:pPr>
+      <w:r>
+        <w:rPr>
+          <w:sz w:val="18"/>
+        </w:rPr>
         <w:t>Replay context: 0 / 120 s. Saved run: 20261024T190206689673Z-9a66375e. Raw trace and settings accompany the paper.</w:t>
       </w:r>
     </w:p>
     <w:p>
       <w:pPr>
         <w:keepNext/>
-        <w:pageBreakBefore/>
         <w:spacing w:after="140"/>
         <w:jc w:val="center"/>
-      </w:pPr>
-      <w:r>
-        <w:drawing>
-          <wp:inline xmlns:a="http://schemas.openxmlformats.org/drawingml/2006/main" xmlns:pic="http://schemas.openxmlformats.org/drawingml/2006/picture">
-            <wp:extent cx="5943600" cy="4285053"/>
-            <wp:docPr id="1570744390" name="Picture 1570744390" descr="At 85% moisture both controllers issue zero and both logical pump outputs remain off."/>
-            <wp:cNvGraphicFramePr>
-              <a:graphicFrameLocks noChangeAspect="1"/>
-            </wp:cNvGraphicFramePr>
-            <a:graphic>
-              <a:graphicData uri="http://schemas.openxmlformats.org/drawingml/2006/picture">
-                <pic:pic>
-                  <pic:nvPicPr>
-                    <pic:cNvPr id="0" name="paper-wet.jpg"/>
-                    <pic:cNvPicPr/>
-                  </pic:nvPicPr>
-                  <pic:blipFill>
-                    <a:blip r:embed="rId15"/>
-                    <a:stretch>
-                      <a:fillRect/>
-                    </a:stretch>
-                  </pic:blipFill>
-                  <pic:spPr>
-                    <a:xfrm>
-                      <a:off x="0" y="0"/>
-                      <a:ext cx="5943600" cy="4285053"/>
-                    </a:xfrm>
-                    <a:prstGeom prst="rect"/>
-                  </pic:spPr>
-                </pic:pic>
-              </a:graphicData>
-            </a:graphic>
-          </wp:inline>
-        </w:drawing>
-      </w:r>
-    </w:p>
-    <w:p>
-      <w:pPr>
         <w:keepNext/>
-        <w:spacing w:after="140"/>
-        <w:jc w:val="left"/>
-      </w:pPr>
-      <w:r>
-        <w:rPr>
-          <w:i/>
-          <w:sz w:val="20"/>
-        </w:rPr>
-        <w:t>Figure 7: At 85% moisture both controllers issue zero and both logical pump outputs remain off.</w:t>
-      </w:r>
-    </w:p>
-    <w:p>
-      <w:pPr>
-        <w:spacing w:after="140"/>
-      </w:pPr>
-      <w:r>
-        <w:rPr>
-          <w:sz w:val="18"/>
-        </w:rPr>
-        <w:t>Replay context: 0 / 120 s. Saved run: 20261024T190209514836Z-3f3b5a77. Raw trace and settings accompany the paper.</w:t>
-      </w:r>
-    </w:p>
-    <w:p>
-      <w:pPr>
-        <w:keepNext/>
-        <w:pageBreakBefore/>
-        <w:spacing w:after="140"/>
-        <w:jc w:val="center"/>
-      </w:pPr>
-      <w:r>
-        <w:drawing>
-          <wp:inline xmlns:a="http://schemas.openxmlformats.org/drawingml/2006/main" xmlns:pic="http://schemas.openxmlformats.org/drawingml/2006/picture">
-            <wp:extent cx="5943600" cy="4285053"/>
-            <wp:docPr id="1570744391" name="Picture 1570744391" descr="At exactly 30% moisture the inclusive low-moisture alert is active; the fuzzy command is 20 minutes while the strict threshold reference is zero."/>
-            <wp:cNvGraphicFramePr>
-              <a:graphicFrameLocks noChangeAspect="1"/>
-            </wp:cNvGraphicFramePr>
-            <a:graphic>
-              <a:graphicData uri="http://schemas.openxmlformats.org/drawingml/2006/picture">
-                <pic:pic>
-                  <pic:nvPicPr>
-                    <pic:cNvPr id="0" name="paper-boundary.jpg"/>
-                    <pic:cNvPicPr/>
-                  </pic:nvPicPr>
-                  <pic:blipFill>
-                    <a:blip r:embed="rId16"/>
-                    <a:stretch>
-                      <a:fillRect/>
-                    </a:stretch>
-                  </pic:blipFill>
-                  <pic:spPr>
-                    <a:xfrm>
-                      <a:off x="0" y="0"/>
-                      <a:ext cx="5943600" cy="4285053"/>
-                    </a:xfrm>
-                    <a:prstGeom prst="rect"/>
-                  </pic:spPr>
-                </pic:pic>
-              </a:graphicData>
-            </a:graphic>
-          </wp:inline>
-        </w:drawing>
-      </w:r>
-    </w:p>
-    <w:p>
-      <w:pPr>
-        <w:keepNext/>
-        <w:spacing w:after="140"/>
-        <w:jc w:val="left"/>
-      </w:pPr>
-      <w:r>
-        <w:rPr>
-          <w:i/>
-          <w:sz w:val="20"/>
-        </w:rPr>
-        <w:t>Figure 8: At exactly 30% moisture the inclusive low-moisture alert is active; the fuzzy command is 20 minutes while the strict threshold reference is zero.</w:t>
-      </w:r>
-    </w:p>
-    <w:p>
-      <w:pPr>
-        <w:spacing w:after="140"/>
-      </w:pPr>
-      <w:r>
-        <w:rPr>
-          <w:sz w:val="18"/>
-        </w:rPr>
-        <w:t>Replay context: 0 / 120 s. Saved run: 20261024T190212418524Z-d9cae169. Raw trace and settings accompany the paper.</w:t>
-      </w:r>
-    </w:p>
-    <w:p>
-      <w:pPr>
-        <w:keepNext/>
-        <w:pageBreakBefore/>
-        <w:spacing w:after="140"/>
-        <w:jc w:val="center"/>
       </w:pPr>
       <w:r>
         <w:drawing>
@@ -16134,2215 +15678,25 @@
     <w:p>
       <w:pPr>
         <w:keepNext/>
-        <w:spacing w:after="140"/>
-        <w:jc w:val="left"/>
-      </w:pPr>
-      <w:r>
-        <w:rPr>
-          <w:i/>
-          <w:sz w:val="20"/>
-        </w:rPr>
-        <w:t>Figure 9: At 15 s raw moisture rises to 90%, while the moving average is 30%. The safety gate stops the pump despite a nonzero 34-minute fuzzy command.</w:t>
-      </w:r>
-    </w:p>
-    <w:p>
-      <w:pPr>
-        <w:spacing w:after="140"/>
+        <w:spacing w:after="100"/>
       </w:pPr>
       <w:r>
         <w:rPr>
           <w:sz w:val="18"/>
         </w:rPr>
+        <w:t>Figure 5: At 15 s raw moisture rises to 90%, while the moving average is 30%. The safety gate stops the pump despite a nonzero 34-minute fuzzy command.</w:t>
+      </w:r>
+    </w:p>
+    <w:p>
+      <w:pPr>
+        <w:spacing w:after="100"/>
+      </w:pPr>
+      <w:r>
+        <w:rPr>
+          <w:sz w:val="18"/>
+        </w:rPr>
         <w:t>Replay context: 15 / 120 s. Saved run: 20261024T190224597554Z-1e1fe932. Raw trace and settings accompany the paper.</w:t>
       </w:r>
-    </w:p>
-    <w:p>
-      <w:pPr>
-        <w:keepNext/>
-        <w:pageBreakBefore/>
-        <w:spacing w:after="140"/>
-        <w:jc w:val="center"/>
-      </w:pPr>
-      <w:r>
-        <w:drawing>
-          <wp:inline xmlns:a="http://schemas.openxmlformats.org/drawingml/2006/main" xmlns:pic="http://schemas.openxmlformats.org/drawingml/2006/picture">
-            <wp:extent cx="5943600" cy="4285053"/>
-            <wp:docPr id="1570744393" name="Picture 1570744393" descr="An injected fault produces unavailable sensor values, zero commands and both outputs off at 15 s."/>
-            <wp:cNvGraphicFramePr>
-              <a:graphicFrameLocks noChangeAspect="1"/>
-            </wp:cNvGraphicFramePr>
-            <a:graphic>
-              <a:graphicData uri="http://schemas.openxmlformats.org/drawingml/2006/picture">
-                <pic:pic>
-                  <pic:nvPicPr>
-                    <pic:cNvPr id="0" name="paper-fault.jpg"/>
-                    <pic:cNvPicPr/>
-                  </pic:nvPicPr>
-                  <pic:blipFill>
-                    <a:blip r:embed="rId18"/>
-                    <a:stretch>
-                      <a:fillRect/>
-                    </a:stretch>
-                  </pic:blipFill>
-                  <pic:spPr>
-                    <a:xfrm>
-                      <a:off x="0" y="0"/>
-                      <a:ext cx="5943600" cy="4285053"/>
-                    </a:xfrm>
-                    <a:prstGeom prst="rect"/>
-                  </pic:spPr>
-                </pic:pic>
-              </a:graphicData>
-            </a:graphic>
-          </wp:inline>
-        </w:drawing>
-      </w:r>
-    </w:p>
-    <w:p>
-      <w:pPr>
-        <w:keepNext/>
-        <w:spacing w:after="140"/>
-        <w:jc w:val="left"/>
-      </w:pPr>
-      <w:r>
-        <w:rPr>
-          <w:i/>
-          <w:sz w:val="20"/>
-        </w:rPr>
-        <w:t>Figure 10: An injected fault produces unavailable sensor values, zero commands and both outputs off at 15 s.</w:t>
-      </w:r>
-    </w:p>
-    <w:p>
-      <w:pPr>
-        <w:spacing w:after="140"/>
-      </w:pPr>
-      <w:r>
-        <w:rPr>
-          <w:sz w:val="18"/>
-        </w:rPr>
-        <w:t>Replay context: 15 / 120 s. Saved run: 20261024T190227823951Z-410c5b7b. Raw trace and settings accompany the paper.</w:t>
-      </w:r>
-    </w:p>
-    <w:p>
-      <w:pPr>
-        <w:keepNext/>
-        <w:pageBreakBefore/>
-        <w:spacing w:after="140"/>
-        <w:jc w:val="center"/>
-      </w:pPr>
-      <w:r>
-        <w:drawing>
-          <wp:inline xmlns:a="http://schemas.openxmlformats.org/drawingml/2006/main" xmlns:pic="http://schemas.openxmlformats.org/drawingml/2006/picture">
-            <wp:extent cx="5943600" cy="4285053"/>
-            <wp:docPr id="1570744394" name="Picture 1570744394" descr="During the 10–40 s transport outage, local control remains active at 35 s while the collector holds its stale 5 s snapshot."/>
-            <wp:cNvGraphicFramePr>
-              <a:graphicFrameLocks noChangeAspect="1"/>
-            </wp:cNvGraphicFramePr>
-            <a:graphic>
-              <a:graphicData uri="http://schemas.openxmlformats.org/drawingml/2006/picture">
-                <pic:pic>
-                  <pic:nvPicPr>
-                    <pic:cNvPr id="0" name="paper-offline.jpg"/>
-                    <pic:cNvPicPr/>
-                  </pic:nvPicPr>
-                  <pic:blipFill>
-                    <a:blip r:embed="rId19"/>
-                    <a:stretch>
-                      <a:fillRect/>
-                    </a:stretch>
-                  </pic:blipFill>
-                  <pic:spPr>
-                    <a:xfrm>
-                      <a:off x="0" y="0"/>
-                      <a:ext cx="5943600" cy="4285053"/>
-                    </a:xfrm>
-                    <a:prstGeom prst="rect"/>
-                  </pic:spPr>
-                </pic:pic>
-              </a:graphicData>
-            </a:graphic>
-          </wp:inline>
-        </w:drawing>
-      </w:r>
-    </w:p>
-    <w:p>
-      <w:pPr>
-        <w:keepNext/>
-        <w:spacing w:after="140"/>
-        <w:jc w:val="left"/>
-      </w:pPr>
-      <w:r>
-        <w:rPr>
-          <w:i/>
-          <w:sz w:val="20"/>
-        </w:rPr>
-        <w:t>Figure 11: During the 10–40 s transport outage, local control remains active at 35 s while the collector holds its stale 5 s snapshot.</w:t>
-      </w:r>
-    </w:p>
-    <w:p>
-      <w:pPr>
-        <w:spacing w:after="140"/>
-      </w:pPr>
-      <w:r>
-        <w:rPr>
-          <w:sz w:val="18"/>
-        </w:rPr>
-        <w:t>Replay context: 35 / 120 s. Saved run: 20261024T190230939923Z-d75c0339. Raw trace and settings accompany the paper.</w:t>
-      </w:r>
-    </w:p>
-    <w:p>
-      <w:pPr>
-        <w:keepNext/>
-        <w:pageBreakBefore/>
-        <w:spacing w:after="140"/>
-        <w:jc w:val="center"/>
-      </w:pPr>
-      <w:r>
-        <w:drawing>
-          <wp:inline xmlns:a="http://schemas.openxmlformats.org/drawingml/2006/main" xmlns:pic="http://schemas.openxmlformats.org/drawingml/2006/picture">
-            <wp:extent cx="5943600" cy="6000206"/>
-            <wp:docPr id="1570744395" name="Picture 1570744395" descr="Seed-7 moisture noise and the five-sample average are plotted against the same simulation clock, with separate fuzzy and reference pump intervals."/>
-            <wp:cNvGraphicFramePr>
-              <a:graphicFrameLocks noChangeAspect="1"/>
-            </wp:cNvGraphicFramePr>
-            <a:graphic>
-              <a:graphicData uri="http://schemas.openxmlformats.org/drawingml/2006/picture">
-                <pic:pic>
-                  <pic:nvPicPr>
-                    <pic:cNvPr id="0" name="paper-noise.jpg"/>
-                    <pic:cNvPicPr/>
-                  </pic:nvPicPr>
-                  <pic:blipFill>
-                    <a:blip r:embed="rId20"/>
-                    <a:stretch>
-                      <a:fillRect/>
-                    </a:stretch>
-                  </pic:blipFill>
-                  <pic:spPr>
-                    <a:xfrm>
-                      <a:off x="0" y="0"/>
-                      <a:ext cx="5943600" cy="6000206"/>
-                    </a:xfrm>
-                    <a:prstGeom prst="rect"/>
-                  </pic:spPr>
-                </pic:pic>
-              </a:graphicData>
-            </a:graphic>
-          </wp:inline>
-        </w:drawing>
-      </w:r>
-    </w:p>
-    <w:p>
-      <w:pPr>
-        <w:keepNext/>
-        <w:spacing w:after="140"/>
-        <w:jc w:val="left"/>
-      </w:pPr>
-      <w:r>
-        <w:rPr>
-          <w:i/>
-          <w:sz w:val="20"/>
-        </w:rPr>
-        <w:t>Figure 12: Seed-7 moisture noise and the five-sample average are plotted against the same simulation clock, with separate fuzzy and reference pump intervals.</w:t>
-      </w:r>
-    </w:p>
-    <w:p>
-      <w:pPr>
-        <w:spacing w:after="140"/>
-      </w:pPr>
-      <w:r>
-        <w:rPr>
-          <w:sz w:val="18"/>
-        </w:rPr>
-        <w:t>Replay context: 0 / 120 s. Saved run: 20261024T190247956135Z-4d6f6805. Raw trace and settings accompany the paper.</w:t>
-      </w:r>
-    </w:p>
-    <w:p>
-      <w:pPr>
-        <w:keepNext/>
-        <w:pageBreakBefore/>
-        <w:spacing w:after="140"/>
-        <w:jc w:val="center"/>
-      </w:pPr>
-      <w:r>
-        <w:drawing>
-          <wp:inline xmlns:a="http://schemas.openxmlformats.org/drawingml/2006/main" xmlns:pic="http://schemas.openxmlformats.org/drawingml/2006/picture">
-            <wp:extent cx="5943600" cy="6119078"/>
-            <wp:docPr id="1570744396" name="Picture 1570744396" descr="A prescribed moisture ramp from 65% to 10% drives both controllers; the plotted moisture is not affected by pump output."/>
-            <wp:cNvGraphicFramePr>
-              <a:graphicFrameLocks noChangeAspect="1"/>
-            </wp:cNvGraphicFramePr>
-            <a:graphic>
-              <a:graphicData uri="http://schemas.openxmlformats.org/drawingml/2006/picture">
-                <pic:pic>
-                  <pic:nvPicPr>
-                    <pic:cNvPr id="0" name="paper-drying.jpg"/>
-                    <pic:cNvPicPr/>
-                  </pic:nvPicPr>
-                  <pic:blipFill>
-                    <a:blip r:embed="rId21"/>
-                    <a:stretch>
-                      <a:fillRect/>
-                    </a:stretch>
-                  </pic:blipFill>
-                  <pic:spPr>
-                    <a:xfrm>
-                      <a:off x="0" y="0"/>
-                      <a:ext cx="5943600" cy="6119078"/>
-                    </a:xfrm>
-                    <a:prstGeom prst="rect"/>
-                  </pic:spPr>
-                </pic:pic>
-              </a:graphicData>
-            </a:graphic>
-          </wp:inline>
-        </w:drawing>
-      </w:r>
-    </w:p>
-    <w:p>
-      <w:pPr>
-        <w:keepNext/>
-        <w:spacing w:after="140"/>
-        <w:jc w:val="left"/>
-      </w:pPr>
-      <w:r>
-        <w:rPr>
-          <w:i/>
-          <w:sz w:val="20"/>
-        </w:rPr>
-        <w:t>Figure 13: A prescribed moisture ramp from 65% to 10% drives both controllers; the plotted moisture is not affected by pump output.</w:t>
-      </w:r>
-    </w:p>
-    <w:p>
-      <w:pPr>
-        <w:spacing w:after="140"/>
-      </w:pPr>
-      <w:r>
-        <w:rPr>
-          <w:sz w:val="18"/>
-        </w:rPr>
-        <w:t>Replay context: 60 / 120 s. Saved run: 20261024T190251842011Z-b53cba5d. Raw trace and settings accompany the paper.</w:t>
-      </w:r>
-    </w:p>
-    <w:p>
-      <w:pPr>
-        <w:keepNext/>
-        <w:pageBreakBefore/>
-        <w:spacing w:after="140"/>
-        <w:jc w:val="center"/>
-      </w:pPr>
-      <w:r>
-        <w:drawing>
-          <wp:inline xmlns:a="http://schemas.openxmlformats.org/drawingml/2006/main" xmlns:pic="http://schemas.openxmlformats.org/drawingml/2006/picture">
-            <wp:extent cx="5943600" cy="5343579"/>
-            <wp:docPr id="1570744397" name="Picture 1570744397" descr="The Python test bench reports 17 of 17 executed checks passed, covering selected commands, rule peaks, boundaries, timer, filtering, faults and transport-surrogate behaviour."/>
-            <wp:cNvGraphicFramePr>
-              <a:graphicFrameLocks noChangeAspect="1"/>
-            </wp:cNvGraphicFramePr>
-            <a:graphic>
-              <a:graphicData uri="http://schemas.openxmlformats.org/drawingml/2006/picture">
-                <pic:pic>
-                  <pic:nvPicPr>
-                    <pic:cNvPr id="0" name="paper-checks.jpg"/>
-                    <pic:cNvPicPr/>
-                  </pic:nvPicPr>
-                  <pic:blipFill>
-                    <a:blip r:embed="rId22"/>
-                    <a:stretch>
-                      <a:fillRect/>
-                    </a:stretch>
-                  </pic:blipFill>
-                  <pic:spPr>
-                    <a:xfrm>
-                      <a:off x="0" y="0"/>
-                      <a:ext cx="5943600" cy="5343579"/>
-                    </a:xfrm>
-                    <a:prstGeom prst="rect"/>
-                  </pic:spPr>
-                </pic:pic>
-              </a:graphicData>
-            </a:graphic>
-          </wp:inline>
-        </w:drawing>
-      </w:r>
-    </w:p>
-    <w:p>
-      <w:pPr>
-        <w:keepNext/>
-        <w:spacing w:after="140"/>
-        <w:jc w:val="left"/>
-      </w:pPr>
-      <w:r>
-        <w:rPr>
-          <w:i/>
-          <w:sz w:val="20"/>
-        </w:rPr>
-        <w:t>Figure 14: The Python test bench reports 17 of 17 executed checks passed, covering selected commands, rule peaks, boundaries, timer, filtering, faults and transport-surrogate behaviour.</w:t>
-      </w:r>
-    </w:p>
-    <w:p>
-      <w:pPr>
-        <w:spacing w:after="140"/>
-      </w:pPr>
-      <w:r>
-        <w:rPr>
-          <w:sz w:val="18"/>
-        </w:rPr>
-        <w:t>Software regression bench: 17/17 checks passed. The screenshot shows executed checks; it is not a field-trial accuracy test.</w:t>
-      </w:r>
-    </w:p>
-    <w:p>
-      <w:pPr>
-        <w:keepNext/>
-        <w:pageBreakBefore/>
-        <w:spacing w:after="140"/>
-        <w:jc w:val="center"/>
-      </w:pPr>
-      <w:r>
-        <w:drawing>
-          <wp:inline xmlns:a="http://schemas.openxmlformats.org/drawingml/2006/main" xmlns:pic="http://schemas.openxmlformats.org/drawingml/2006/picture">
-            <wp:extent cx="5943600" cy="3503893"/>
-            <wp:docPr id="1570744398" name="Picture 1570744398" descr="The separate crop experiment reports held-out dataset metrics from 1,760 training and 440 test records; this does not validate physical soil-moisture inputs."/>
-            <wp:cNvGraphicFramePr>
-              <a:graphicFrameLocks noChangeAspect="1"/>
-            </wp:cNvGraphicFramePr>
-            <a:graphic>
-              <a:graphicData uri="http://schemas.openxmlformats.org/drawingml/2006/picture">
-                <pic:pic>
-                  <pic:nvPicPr>
-                    <pic:cNvPr id="0" name="paper-crops.jpg"/>
-                    <pic:cNvPicPr/>
-                  </pic:nvPicPr>
-                  <pic:blipFill>
-                    <a:blip r:embed="rId23"/>
-                    <a:stretch>
-                      <a:fillRect/>
-                    </a:stretch>
-                  </pic:blipFill>
-                  <pic:spPr>
-                    <a:xfrm>
-                      <a:off x="0" y="0"/>
-                      <a:ext cx="5943600" cy="3503893"/>
-                    </a:xfrm>
-                    <a:prstGeom prst="rect"/>
-                  </pic:spPr>
-                </pic:pic>
-              </a:graphicData>
-            </a:graphic>
-          </wp:inline>
-        </w:drawing>
-      </w:r>
-    </w:p>
-    <w:p>
-      <w:pPr>
-        <w:keepNext/>
-        <w:spacing w:after="140"/>
-        <w:jc w:val="left"/>
-      </w:pPr>
-      <w:r>
-        <w:rPr>
-          <w:i/>
-          <w:sz w:val="20"/>
-        </w:rPr>
-        <w:t>Figure 15: The separate crop experiment reports held-out dataset metrics from 1,760 training and 440 test records; this does not validate physical soil-moisture inputs.</w:t>
-      </w:r>
-    </w:p>
-    <w:p>
-      <w:pPr>
-        <w:spacing w:after="140"/>
-      </w:pPr>
-      <w:r>
-        <w:rPr>
-          <w:sz w:val="18"/>
-        </w:rPr>
-        <w:t>Replay context: 60 / 120 s. Saved run: 20261024T190251842011Z-b53cba5d. Input conditions are listed in Table 6; the crop view uses initial inputs independently of replay.</w:t>
-      </w:r>
-    </w:p>
-    <w:p>
-      <w:pPr>
-        <w:keepNext w:val="0"/>
-        <w:spacing w:after="0" w:before="0"/>
-        <w:sectPr>
-          <w:type w:val="nextPage"/>
-          <w:pgSz w:w="12240" w:h="15840"/>
-          <w:pgMar w:top="1440" w:right="1440" w:bottom="1440" w:left="1440" w:header="708" w:footer="708" w:gutter="0"/>
-          <w:cols w:space="720"/>
-          <w:docGrid w:linePitch="360"/>
-        </w:sectPr>
-      </w:pPr>
-    </w:p>
-    <w:p>
-      <w:pPr>
-        <w:keepNext w:val="0"/>
-        <w:pageBreakBefore w:val="0"/>
-        <w:spacing w:after="120"/>
-      </w:pPr>
-      <w:r>
-        <w:rPr>
-          <w:b/>
-          <w:sz w:val="24"/>
-        </w:rPr>
-        <w:t>W-02  Wet soil no dose</w:t>
-      </w:r>
-    </w:p>
-    <w:p>
-      <w:pPr>
-        <w:keepNext w:val="0"/>
-        <w:spacing w:after="120"/>
-      </w:pPr>
-      <w:r>
-        <w:rPr>
-          <w:b w:val="0"/>
-          <w:sz w:val="20"/>
-        </w:rPr>
-        <w:t>Commands: CASE 2. Conditions: M=85%, T=27 C, RH=60%.</w:t>
-      </w:r>
-    </w:p>
-    <w:p>
-      <w:pPr>
-        <w:keepNext/>
-        <w:spacing w:after="120"/>
-        <w:jc w:val="center"/>
-      </w:pPr>
-      <w:r>
-        <w:drawing>
-          <wp:inline xmlns:a="http://schemas.openxmlformats.org/drawingml/2006/main" xmlns:pic="http://schemas.openxmlformats.org/drawingml/2006/picture">
-            <wp:extent cx="8229600" cy="3936460"/>
-            <wp:docPr id="1570744402" name="Picture 1570744402" descr="Figure 16, W-02: Wet soil: zero command; pump OFF/LOW."/>
-            <wp:cNvGraphicFramePr>
-              <a:graphicFrameLocks noChangeAspect="1"/>
-            </wp:cNvGraphicFramePr>
-            <a:graphic>
-              <a:graphicData uri="http://schemas.openxmlformats.org/drawingml/2006/picture">
-                <pic:pic>
-                  <pic:nvPicPr>
-                    <pic:cNvPr id="0" name="TC02-wet-soil-no-dose.jpg"/>
-                    <pic:cNvPicPr/>
-                  </pic:nvPicPr>
-                  <pic:blipFill>
-                    <a:blip r:embed="rId28"/>
-                    <a:stretch>
-                      <a:fillRect/>
-                    </a:stretch>
-                  </pic:blipFill>
-                  <pic:spPr>
-                    <a:xfrm>
-                      <a:off x="0" y="0"/>
-                      <a:ext cx="8229600" cy="3936460"/>
-                    </a:xfrm>
-                    <a:prstGeom prst="rect"/>
-                  </pic:spPr>
-                </pic:pic>
-              </a:graphicData>
-            </a:graphic>
-          </wp:inline>
-        </w:drawing>
-      </w:r>
-    </w:p>
-    <w:p>
-      <w:pPr>
-        <w:keepNext w:val="0"/>
-        <w:spacing w:after="120"/>
-      </w:pPr>
-      <w:r>
-        <w:rPr>
-          <w:b w:val="0"/>
-          <w:sz w:val="18"/>
-        </w:rPr>
-        <w:t>Figure 16: Wet soil: zero command; pump OFF/LOW. Captured command 0 min; output OFF/GPIO2 LOW; sensor VALID; alert NO; MQTT ON. Result: PASS.</w:t>
-      </w:r>
-    </w:p>
-    <w:p>
-      <w:pPr>
-        <w:keepNext w:val="0"/>
-        <w:spacing w:after="120"/>
-      </w:pPr>
-      <w:r>
-        <w:rPr>
-          <w:b w:val="0"/>
-          <w:sz w:val="18"/>
-        </w:rPr>
-        <w:t>Source: serial/TC02-wet-soil-no-dose.txt; device uptime 103548 ms. Paused OLED refresh may appear dithered.</w:t>
-      </w:r>
-    </w:p>
-    <w:p>
-      <w:pPr>
-        <w:keepNext w:val="0"/>
-        <w:pageBreakBefore/>
-        <w:spacing w:after="120"/>
-      </w:pPr>
-      <w:r>
-        <w:rPr>
-          <w:b/>
-          <w:sz w:val="24"/>
-        </w:rPr>
-        <w:t>W-03  Hot dry maximum command</w:t>
-      </w:r>
-    </w:p>
-    <w:p>
-      <w:pPr>
-        <w:keepNext w:val="0"/>
-        <w:spacing w:after="120"/>
-      </w:pPr>
-      <w:r>
-        <w:rPr>
-          <w:b w:val="0"/>
-          <w:sz w:val="20"/>
-        </w:rPr>
-        <w:t>Commands: CASE 3. Conditions: M=10%, T=45 C, RH=20%.</w:t>
-      </w:r>
-    </w:p>
-    <w:p>
-      <w:pPr>
-        <w:keepNext/>
-        <w:spacing w:after="120"/>
-        <w:jc w:val="center"/>
-      </w:pPr>
-      <w:r>
-        <w:drawing>
-          <wp:inline xmlns:a="http://schemas.openxmlformats.org/drawingml/2006/main" xmlns:pic="http://schemas.openxmlformats.org/drawingml/2006/picture">
-            <wp:extent cx="8229600" cy="3936460"/>
-            <wp:docPr id="1570744403" name="Picture 1570744403" descr="Figure 17, W-03: Hot, dry soil: maximum 40 min command; alert and pump ON."/>
-            <wp:cNvGraphicFramePr>
-              <a:graphicFrameLocks noChangeAspect="1"/>
-            </wp:cNvGraphicFramePr>
-            <a:graphic>
-              <a:graphicData uri="http://schemas.openxmlformats.org/drawingml/2006/picture">
-                <pic:pic>
-                  <pic:nvPicPr>
-                    <pic:cNvPr id="0" name="TC03-hot-dry-maximum-command.jpg"/>
-                    <pic:cNvPicPr/>
-                  </pic:nvPicPr>
-                  <pic:blipFill>
-                    <a:blip r:embed="rId29"/>
-                    <a:stretch>
-                      <a:fillRect/>
-                    </a:stretch>
-                  </pic:blipFill>
-                  <pic:spPr>
-                    <a:xfrm>
-                      <a:off x="0" y="0"/>
-                      <a:ext cx="8229600" cy="3936460"/>
-                    </a:xfrm>
-                    <a:prstGeom prst="rect"/>
-                  </pic:spPr>
-                </pic:pic>
-              </a:graphicData>
-            </a:graphic>
-          </wp:inline>
-        </w:drawing>
-      </w:r>
-    </w:p>
-    <w:p>
-      <w:pPr>
-        <w:keepNext w:val="0"/>
-        <w:spacing w:after="120"/>
-      </w:pPr>
-      <w:r>
-        <w:rPr>
-          <w:b w:val="0"/>
-          <w:sz w:val="18"/>
-        </w:rPr>
-        <w:t>Figure 17: Hot, dry soil: maximum 40 min command; alert and pump ON. Captured command 40 min; output ON/GPIO2 HIGH; sensor VALID; alert YES; MQTT ON. Result: PASS.</w:t>
-      </w:r>
-    </w:p>
-    <w:p>
-      <w:pPr>
-        <w:keepNext w:val="0"/>
-        <w:spacing w:after="120"/>
-      </w:pPr>
-      <w:r>
-        <w:rPr>
-          <w:b w:val="0"/>
-          <w:sz w:val="18"/>
-        </w:rPr>
-        <w:t>Source: serial/TC03-hot-dry-maximum-command.txt; device uptime 103651 ms. Paused OLED refresh may appear dithered.</w:t>
-      </w:r>
-    </w:p>
-    <w:p>
-      <w:pPr>
-        <w:keepNext w:val="0"/>
-        <w:pageBreakBefore/>
-        <w:spacing w:after="120"/>
-      </w:pPr>
-      <w:r>
-        <w:rPr>
-          <w:b/>
-          <w:sz w:val="24"/>
-        </w:rPr>
-        <w:t>W-04  Inclusive alert at thirty percent</w:t>
-      </w:r>
-    </w:p>
-    <w:p>
-      <w:pPr>
-        <w:keepNext w:val="0"/>
-        <w:spacing w:after="120"/>
-      </w:pPr>
-      <w:r>
-        <w:rPr>
-          <w:b w:val="0"/>
-          <w:sz w:val="20"/>
-        </w:rPr>
-        <w:t>Commands: CASE 4. Conditions: M=30%, T=27 C, RH=60%.</w:t>
-      </w:r>
-    </w:p>
-    <w:p>
-      <w:pPr>
-        <w:keepNext/>
-        <w:spacing w:after="120"/>
-        <w:jc w:val="center"/>
-      </w:pPr>
-      <w:r>
-        <w:drawing>
-          <wp:inline xmlns:a="http://schemas.openxmlformats.org/drawingml/2006/main" xmlns:pic="http://schemas.openxmlformats.org/drawingml/2006/picture">
-            <wp:extent cx="8229600" cy="3936460"/>
-            <wp:docPr id="1570744404" name="Picture 1570744404" descr="Figure 18, W-04: Inclusive low-moisture alert boundary: alert YES; command 20 min."/>
-            <wp:cNvGraphicFramePr>
-              <a:graphicFrameLocks noChangeAspect="1"/>
-            </wp:cNvGraphicFramePr>
-            <a:graphic>
-              <a:graphicData uri="http://schemas.openxmlformats.org/drawingml/2006/picture">
-                <pic:pic>
-                  <pic:nvPicPr>
-                    <pic:cNvPr id="0" name="TC04-inclusive-alert-at-thirty-percent.jpg"/>
-                    <pic:cNvPicPr/>
-                  </pic:nvPicPr>
-                  <pic:blipFill>
-                    <a:blip r:embed="rId30"/>
-                    <a:stretch>
-                      <a:fillRect/>
-                    </a:stretch>
-                  </pic:blipFill>
-                  <pic:spPr>
-                    <a:xfrm>
-                      <a:off x="0" y="0"/>
-                      <a:ext cx="8229600" cy="3936460"/>
-                    </a:xfrm>
-                    <a:prstGeom prst="rect"/>
-                  </pic:spPr>
-                </pic:pic>
-              </a:graphicData>
-            </a:graphic>
-          </wp:inline>
-        </w:drawing>
-      </w:r>
-    </w:p>
-    <w:p>
-      <w:pPr>
-        <w:keepNext w:val="0"/>
-        <w:spacing w:after="120"/>
-      </w:pPr>
-      <w:r>
-        <w:rPr>
-          <w:b w:val="0"/>
-          <w:sz w:val="18"/>
-        </w:rPr>
-        <w:t>Figure 18: Inclusive low-moisture alert boundary: alert YES; command 20 min. Captured command 20 min; output ON/GPIO2 HIGH; sensor VALID; alert YES; MQTT ON. Result: PASS.</w:t>
-      </w:r>
-    </w:p>
-    <w:p>
-      <w:pPr>
-        <w:keepNext w:val="0"/>
-        <w:spacing w:after="120"/>
-      </w:pPr>
-      <w:r>
-        <w:rPr>
-          <w:b w:val="0"/>
-          <w:sz w:val="18"/>
-        </w:rPr>
-        <w:t>Source: serial/TC04-inclusive-alert-at-thirty-percent.txt; device uptime 104485 ms. Paused OLED refresh may appear dithered.</w:t>
-      </w:r>
-    </w:p>
-    <w:p>
-      <w:pPr>
-        <w:keepNext w:val="0"/>
-        <w:pageBreakBefore/>
-        <w:spacing w:after="120"/>
-      </w:pPr>
-      <w:r>
-        <w:rPr>
-          <w:b/>
-          <w:sz w:val="24"/>
-        </w:rPr>
-        <w:t>W-05  Above threshold at thirty one percent</w:t>
-      </w:r>
-    </w:p>
-    <w:p>
-      <w:pPr>
-        <w:keepNext w:val="0"/>
-        <w:spacing w:after="120"/>
-      </w:pPr>
-      <w:r>
-        <w:rPr>
-          <w:b w:val="0"/>
-          <w:sz w:val="20"/>
-        </w:rPr>
-        <w:t>Commands: CASE 5. Conditions: M=31%, T=27 C, RH=60%.</w:t>
-      </w:r>
-    </w:p>
-    <w:p>
-      <w:pPr>
-        <w:keepNext/>
-        <w:spacing w:after="120"/>
-        <w:jc w:val="center"/>
-      </w:pPr>
-      <w:r>
-        <w:drawing>
-          <wp:inline xmlns:a="http://schemas.openxmlformats.org/drawingml/2006/main" xmlns:pic="http://schemas.openxmlformats.org/drawingml/2006/picture">
-            <wp:extent cx="8229600" cy="3936460"/>
-            <wp:docPr id="1570744405" name="Picture 1570744405" descr="Figure 19, W-05: Above alert boundary: alert NO; command 19.4 min."/>
-            <wp:cNvGraphicFramePr>
-              <a:graphicFrameLocks noChangeAspect="1"/>
-            </wp:cNvGraphicFramePr>
-            <a:graphic>
-              <a:graphicData uri="http://schemas.openxmlformats.org/drawingml/2006/picture">
-                <pic:pic>
-                  <pic:nvPicPr>
-                    <pic:cNvPr id="0" name="TC05-above-threshold-at-thirty-one-percent.jpg"/>
-                    <pic:cNvPicPr/>
-                  </pic:nvPicPr>
-                  <pic:blipFill>
-                    <a:blip r:embed="rId31"/>
-                    <a:stretch>
-                      <a:fillRect/>
-                    </a:stretch>
-                  </pic:blipFill>
-                  <pic:spPr>
-                    <a:xfrm>
-                      <a:off x="0" y="0"/>
-                      <a:ext cx="8229600" cy="3936460"/>
-                    </a:xfrm>
-                    <a:prstGeom prst="rect"/>
-                  </pic:spPr>
-                </pic:pic>
-              </a:graphicData>
-            </a:graphic>
-          </wp:inline>
-        </w:drawing>
-      </w:r>
-    </w:p>
-    <w:p>
-      <w:pPr>
-        <w:keepNext w:val="0"/>
-        <w:spacing w:after="120"/>
-      </w:pPr>
-      <w:r>
-        <w:rPr>
-          <w:b w:val="0"/>
-          <w:sz w:val="18"/>
-        </w:rPr>
-        <w:t>Figure 19: Above alert boundary: alert NO; command 19.4 min. Captured command 19.4 min; output ON/GPIO2 HIGH; sensor VALID; alert NO; MQTT ON. Result: PASS.</w:t>
-      </w:r>
-    </w:p>
-    <w:p>
-      <w:pPr>
-        <w:keepNext w:val="0"/>
-        <w:spacing w:after="120"/>
-      </w:pPr>
-      <w:r>
-        <w:rPr>
-          <w:b w:val="0"/>
-          <w:sz w:val="18"/>
-        </w:rPr>
-        <w:t>Source: serial/TC05-above-threshold-at-thirty-one-percent.txt; device uptime 104653 ms. Paused OLED refresh may appear dithered.</w:t>
-      </w:r>
-    </w:p>
-    <w:p>
-      <w:pPr>
-        <w:keepNext w:val="0"/>
-        <w:pageBreakBefore/>
-        <w:spacing w:after="120"/>
-      </w:pPr>
-      <w:r>
-        <w:rPr>
-          <w:b/>
-          <w:sz w:val="24"/>
-        </w:rPr>
-        <w:t>W-06  Cold dry rule coverage</w:t>
-      </w:r>
-    </w:p>
-    <w:p>
-      <w:pPr>
-        <w:keepNext w:val="0"/>
-        <w:spacing w:after="120"/>
-      </w:pPr>
-      <w:r>
-        <w:rPr>
-          <w:b w:val="0"/>
-          <w:sz w:val="20"/>
-        </w:rPr>
-        <w:t>Commands: CASE 6. Conditions: M=10%, T=10 C, RH=20%.</w:t>
-      </w:r>
-    </w:p>
-    <w:p>
-      <w:pPr>
-        <w:keepNext/>
-        <w:spacing w:after="120"/>
-        <w:jc w:val="center"/>
-      </w:pPr>
-      <w:r>
-        <w:drawing>
-          <wp:inline xmlns:a="http://schemas.openxmlformats.org/drawingml/2006/main" xmlns:pic="http://schemas.openxmlformats.org/drawingml/2006/picture">
-            <wp:extent cx="8229600" cy="3936460"/>
-            <wp:docPr id="1570744406" name="Picture 1570744406" descr="Figure 20, W-06: Cold, dry soil remains covered: command 22 min."/>
-            <wp:cNvGraphicFramePr>
-              <a:graphicFrameLocks noChangeAspect="1"/>
-            </wp:cNvGraphicFramePr>
-            <a:graphic>
-              <a:graphicData uri="http://schemas.openxmlformats.org/drawingml/2006/picture">
-                <pic:pic>
-                  <pic:nvPicPr>
-                    <pic:cNvPr id="0" name="TC06-cold-dry-rule-coverage.jpg"/>
-                    <pic:cNvPicPr/>
-                  </pic:nvPicPr>
-                  <pic:blipFill>
-                    <a:blip r:embed="rId32"/>
-                    <a:stretch>
-                      <a:fillRect/>
-                    </a:stretch>
-                  </pic:blipFill>
-                  <pic:spPr>
-                    <a:xfrm>
-                      <a:off x="0" y="0"/>
-                      <a:ext cx="8229600" cy="3936460"/>
-                    </a:xfrm>
-                    <a:prstGeom prst="rect"/>
-                  </pic:spPr>
-                </pic:pic>
-              </a:graphicData>
-            </a:graphic>
-          </wp:inline>
-        </w:drawing>
-      </w:r>
-    </w:p>
-    <w:p>
-      <w:pPr>
-        <w:keepNext w:val="0"/>
-        <w:spacing w:after="120"/>
-      </w:pPr>
-      <w:r>
-        <w:rPr>
-          <w:b w:val="0"/>
-          <w:sz w:val="18"/>
-        </w:rPr>
-        <w:t>Figure 20: Cold, dry soil remains covered: command 22 min. Captured command 22 min; output ON/GPIO2 HIGH; sensor VALID; alert YES; MQTT ON. Result: PASS.</w:t>
-      </w:r>
-    </w:p>
-    <w:p>
-      <w:pPr>
-        <w:keepNext w:val="0"/>
-        <w:spacing w:after="120"/>
-      </w:pPr>
-      <w:r>
-        <w:rPr>
-          <w:b w:val="0"/>
-          <w:sz w:val="18"/>
-        </w:rPr>
-        <w:t>Source: serial/TC06-cold-dry-rule-coverage.txt; device uptime 115031 ms. Paused OLED refresh may appear dithered.</w:t>
-      </w:r>
-    </w:p>
-    <w:p>
-      <w:pPr>
-        <w:keepNext w:val="0"/>
-        <w:pageBreakBefore/>
-        <w:spacing w:after="120"/>
-      </w:pPr>
-      <w:r>
-        <w:rPr>
-          <w:b/>
-          <w:sz w:val="24"/>
-        </w:rPr>
-        <w:t>W-07  Valid minimum domain endpoint</w:t>
-      </w:r>
-    </w:p>
-    <w:p>
-      <w:pPr>
-        <w:keepNext w:val="0"/>
-        <w:spacing w:after="120"/>
-      </w:pPr>
-      <w:r>
-        <w:rPr>
-          <w:b w:val="0"/>
-          <w:sz w:val="20"/>
-        </w:rPr>
-        <w:t>Commands: CASE 7. Conditions: M=0%, T=0 C, RH=0%.</w:t>
-      </w:r>
-    </w:p>
-    <w:p>
-      <w:pPr>
-        <w:keepNext/>
-        <w:spacing w:after="120"/>
-        <w:jc w:val="center"/>
-      </w:pPr>
-      <w:r>
-        <w:drawing>
-          <wp:inline xmlns:a="http://schemas.openxmlformats.org/drawingml/2006/main" xmlns:pic="http://schemas.openxmlformats.org/drawingml/2006/picture">
-            <wp:extent cx="8229600" cy="3936460"/>
-            <wp:docPr id="1570744407" name="Picture 1570744407" descr="Figure 21, W-07: Lower valid domain endpoint: command 22 min; valid sensor state."/>
-            <wp:cNvGraphicFramePr>
-              <a:graphicFrameLocks noChangeAspect="1"/>
-            </wp:cNvGraphicFramePr>
-            <a:graphic>
-              <a:graphicData uri="http://schemas.openxmlformats.org/drawingml/2006/picture">
-                <pic:pic>
-                  <pic:nvPicPr>
-                    <pic:cNvPr id="0" name="TC07-valid-minimum-domain-endpoint.jpg"/>
-                    <pic:cNvPicPr/>
-                  </pic:nvPicPr>
-                  <pic:blipFill>
-                    <a:blip r:embed="rId33"/>
-                    <a:stretch>
-                      <a:fillRect/>
-                    </a:stretch>
-                  </pic:blipFill>
-                  <pic:spPr>
-                    <a:xfrm>
-                      <a:off x="0" y="0"/>
-                      <a:ext cx="8229600" cy="3936460"/>
-                    </a:xfrm>
-                    <a:prstGeom prst="rect"/>
-                  </pic:spPr>
-                </pic:pic>
-              </a:graphicData>
-            </a:graphic>
-          </wp:inline>
-        </w:drawing>
-      </w:r>
-    </w:p>
-    <w:p>
-      <w:pPr>
-        <w:keepNext w:val="0"/>
-        <w:spacing w:after="120"/>
-      </w:pPr>
-      <w:r>
-        <w:rPr>
-          <w:b w:val="0"/>
-          <w:sz w:val="18"/>
-        </w:rPr>
-        <w:t>Figure 21: Lower valid domain endpoint: command 22 min; valid sensor state. Captured command 22 min; output ON/GPIO2 HIGH; sensor VALID; alert YES; MQTT ON. Result: PASS.</w:t>
-      </w:r>
-    </w:p>
-    <w:p>
-      <w:pPr>
-        <w:keepNext w:val="0"/>
-        <w:spacing w:after="120"/>
-      </w:pPr>
-      <w:r>
-        <w:rPr>
-          <w:b w:val="0"/>
-          <w:sz w:val="18"/>
-        </w:rPr>
-        <w:t>Source: serial/TC07-valid-minimum-domain-endpoint.txt; device uptime 125141 ms. Paused OLED refresh may appear dithered.</w:t>
-      </w:r>
-    </w:p>
-    <w:p>
-      <w:pPr>
-        <w:keepNext w:val="0"/>
-        <w:pageBreakBefore/>
-        <w:spacing w:after="120"/>
-      </w:pPr>
-      <w:r>
-        <w:rPr>
-          <w:b/>
-          <w:sz w:val="24"/>
-        </w:rPr>
-        <w:t>W-08  Valid maximum domain endpoint</w:t>
-      </w:r>
-    </w:p>
-    <w:p>
-      <w:pPr>
-        <w:keepNext w:val="0"/>
-        <w:spacing w:after="120"/>
-      </w:pPr>
-      <w:r>
-        <w:rPr>
-          <w:b w:val="0"/>
-          <w:sz w:val="20"/>
-        </w:rPr>
-        <w:t>Commands: CASE 8. Conditions: M=100%, T=50 C, RH=100%.</w:t>
-      </w:r>
-    </w:p>
-    <w:p>
-      <w:pPr>
-        <w:keepNext/>
-        <w:spacing w:after="120"/>
-        <w:jc w:val="center"/>
-      </w:pPr>
-      <w:r>
-        <w:drawing>
-          <wp:inline xmlns:a="http://schemas.openxmlformats.org/drawingml/2006/main" xmlns:pic="http://schemas.openxmlformats.org/drawingml/2006/picture">
-            <wp:extent cx="8229600" cy="3936460"/>
-            <wp:docPr id="1570744408" name="Picture 1570744408" descr="Figure 22, W-08: Upper valid endpoint: command zero; pump OFF."/>
-            <wp:cNvGraphicFramePr>
-              <a:graphicFrameLocks noChangeAspect="1"/>
-            </wp:cNvGraphicFramePr>
-            <a:graphic>
-              <a:graphicData uri="http://schemas.openxmlformats.org/drawingml/2006/picture">
-                <pic:pic>
-                  <pic:nvPicPr>
-                    <pic:cNvPr id="0" name="TC08-valid-maximum-domain-endpoint.jpg"/>
-                    <pic:cNvPicPr/>
-                  </pic:nvPicPr>
-                  <pic:blipFill>
-                    <a:blip r:embed="rId34"/>
-                    <a:stretch>
-                      <a:fillRect/>
-                    </a:stretch>
-                  </pic:blipFill>
-                  <pic:spPr>
-                    <a:xfrm>
-                      <a:off x="0" y="0"/>
-                      <a:ext cx="8229600" cy="3936460"/>
-                    </a:xfrm>
-                    <a:prstGeom prst="rect"/>
-                  </pic:spPr>
-                </pic:pic>
-              </a:graphicData>
-            </a:graphic>
-          </wp:inline>
-        </w:drawing>
-      </w:r>
-    </w:p>
-    <w:p>
-      <w:pPr>
-        <w:keepNext w:val="0"/>
-        <w:spacing w:after="120"/>
-      </w:pPr>
-      <w:r>
-        <w:rPr>
-          <w:b w:val="0"/>
-          <w:sz w:val="18"/>
-        </w:rPr>
-        <w:t>Figure 22: Upper valid endpoint: command zero; pump OFF. Captured command 0 min; output OFF/GPIO2 LOW; sensor VALID; alert NO; MQTT ON. Result: PASS.</w:t>
-      </w:r>
-    </w:p>
-    <w:p>
-      <w:pPr>
-        <w:keepNext w:val="0"/>
-        <w:spacing w:after="120"/>
-      </w:pPr>
-      <w:r>
-        <w:rPr>
-          <w:b w:val="0"/>
-          <w:sz w:val="18"/>
-        </w:rPr>
-        <w:t>Source: serial/TC08-valid-maximum-domain-endpoint.txt; device uptime 127804 ms. Paused OLED refresh may appear dithered.</w:t>
-      </w:r>
-    </w:p>
-    <w:p>
-      <w:pPr>
-        <w:keepNext w:val="0"/>
-        <w:pageBreakBefore/>
-        <w:spacing w:after="120"/>
-      </w:pPr>
-      <w:r>
-        <w:rPr>
-          <w:b/>
-          <w:sz w:val="24"/>
-        </w:rPr>
-        <w:t>W-09  Fault during active dose stops gpio</w:t>
-      </w:r>
-    </w:p>
-    <w:p>
-      <w:pPr>
-        <w:keepNext w:val="0"/>
-        <w:spacing w:after="120"/>
-      </w:pPr>
-      <w:r>
-        <w:rPr>
-          <w:b w:val="0"/>
-          <w:sz w:val="20"/>
-        </w:rPr>
-        <w:t>Commands: CASE 9; then FAULT ON while pump is ON. Conditions: Start at 10%,45 C,20%.</w:t>
-      </w:r>
-    </w:p>
-    <w:p>
-      <w:pPr>
-        <w:keepNext/>
-        <w:spacing w:after="120"/>
-        <w:jc w:val="center"/>
-      </w:pPr>
-      <w:r>
-        <w:drawing>
-          <wp:inline xmlns:a="http://schemas.openxmlformats.org/drawingml/2006/main" xmlns:pic="http://schemas.openxmlformats.org/drawingml/2006/picture">
-            <wp:extent cx="8229600" cy="3936460"/>
-            <wp:docPr id="1570744409" name="Picture 1570744409" descr="Figure 23, W-09: Injected sensor fault stops the active pump; sensor FAULT; command zero."/>
-            <wp:cNvGraphicFramePr>
-              <a:graphicFrameLocks noChangeAspect="1"/>
-            </wp:cNvGraphicFramePr>
-            <a:graphic>
-              <a:graphicData uri="http://schemas.openxmlformats.org/drawingml/2006/picture">
-                <pic:pic>
-                  <pic:nvPicPr>
-                    <pic:cNvPr id="0" name="TC09-fault-during-active-dose-stops-gpio.jpg"/>
-                    <pic:cNvPicPr/>
-                  </pic:nvPicPr>
-                  <pic:blipFill>
-                    <a:blip r:embed="rId35"/>
-                    <a:stretch>
-                      <a:fillRect/>
-                    </a:stretch>
-                  </pic:blipFill>
-                  <pic:spPr>
-                    <a:xfrm>
-                      <a:off x="0" y="0"/>
-                      <a:ext cx="8229600" cy="3936460"/>
-                    </a:xfrm>
-                    <a:prstGeom prst="rect"/>
-                  </pic:spPr>
-                </pic:pic>
-              </a:graphicData>
-            </a:graphic>
-          </wp:inline>
-        </w:drawing>
-      </w:r>
-    </w:p>
-    <w:p>
-      <w:pPr>
-        <w:keepNext w:val="0"/>
-        <w:spacing w:after="120"/>
-      </w:pPr>
-      <w:r>
-        <w:rPr>
-          <w:b w:val="0"/>
-          <w:sz w:val="18"/>
-        </w:rPr>
-        <w:t>Figure 23: Injected sensor fault stops the active pump; sensor FAULT; command zero. Captured command 0 min; output OFF/GPIO2 LOW; sensor FAULT; alert NO; MQTT ON. Result: PASS.</w:t>
-      </w:r>
-    </w:p>
-    <w:p>
-      <w:pPr>
-        <w:keepNext w:val="0"/>
-        <w:spacing w:after="120"/>
-      </w:pPr>
-      <w:r>
-        <w:rPr>
-          <w:b w:val="0"/>
-          <w:sz w:val="18"/>
-        </w:rPr>
-        <w:t>Source: serial/TC09-fault-during-active-dose-stops-gpio.txt; device uptime 141661 ms. Paused OLED refresh may appear dithered.</w:t>
-      </w:r>
-    </w:p>
-    <w:p>
-      <w:pPr>
-        <w:keepNext w:val="0"/>
-        <w:pageBreakBefore/>
-        <w:spacing w:after="120"/>
-      </w:pPr>
-      <w:r>
-        <w:rPr>
-          <w:b/>
-          <w:sz w:val="24"/>
-        </w:rPr>
-        <w:t>W-10  Valid recovery resets filter</w:t>
-      </w:r>
-    </w:p>
-    <w:p>
-      <w:pPr>
-        <w:keepNext w:val="0"/>
-        <w:spacing w:after="120"/>
-      </w:pPr>
-      <w:r>
-        <w:rPr>
-          <w:b w:val="0"/>
-          <w:sz w:val="20"/>
-        </w:rPr>
-        <w:t>Commands: CASE 10. Conditions: M=50%, T=27 C, RH=60%.</w:t>
-      </w:r>
-    </w:p>
-    <w:p>
-      <w:pPr>
-        <w:keepNext/>
-        <w:spacing w:after="120"/>
-        <w:jc w:val="center"/>
-      </w:pPr>
-      <w:r>
-        <w:drawing>
-          <wp:inline xmlns:a="http://schemas.openxmlformats.org/drawingml/2006/main" xmlns:pic="http://schemas.openxmlformats.org/drawingml/2006/picture">
-            <wp:extent cx="8229600" cy="3936460"/>
-            <wp:docPr id="1570744410" name="Picture 1570744410" descr="Figure 24, W-10: Recovery clears injected fault and produces valid 8 min command."/>
-            <wp:cNvGraphicFramePr>
-              <a:graphicFrameLocks noChangeAspect="1"/>
-            </wp:cNvGraphicFramePr>
-            <a:graphic>
-              <a:graphicData uri="http://schemas.openxmlformats.org/drawingml/2006/picture">
-                <pic:pic>
-                  <pic:nvPicPr>
-                    <pic:cNvPr id="0" name="TC10-valid-recovery-resets-filter.jpg"/>
-                    <pic:cNvPicPr/>
-                  </pic:nvPicPr>
-                  <pic:blipFill>
-                    <a:blip r:embed="rId36"/>
-                    <a:stretch>
-                      <a:fillRect/>
-                    </a:stretch>
-                  </pic:blipFill>
-                  <pic:spPr>
-                    <a:xfrm>
-                      <a:off x="0" y="0"/>
-                      <a:ext cx="8229600" cy="3936460"/>
-                    </a:xfrm>
-                    <a:prstGeom prst="rect"/>
-                  </pic:spPr>
-                </pic:pic>
-              </a:graphicData>
-            </a:graphic>
-          </wp:inline>
-        </w:drawing>
-      </w:r>
-    </w:p>
-    <w:p>
-      <w:pPr>
-        <w:keepNext w:val="0"/>
-        <w:spacing w:after="120"/>
-      </w:pPr>
-      <w:r>
-        <w:rPr>
-          <w:b w:val="0"/>
-          <w:sz w:val="18"/>
-        </w:rPr>
-        <w:t>Figure 24: Recovery clears injected fault and produces valid 8 min command. Captured command 8 min; output ON/GPIO2 HIGH; sensor VALID; alert NO; MQTT ON. Result: PASS.</w:t>
-      </w:r>
-    </w:p>
-    <w:p>
-      <w:pPr>
-        <w:keepNext w:val="0"/>
-        <w:spacing w:after="120"/>
-      </w:pPr>
-      <w:r>
-        <w:rPr>
-          <w:b w:val="0"/>
-          <w:sz w:val="18"/>
-        </w:rPr>
-        <w:t>Source: serial/TC10-valid-recovery-resets-filter.txt; device uptime 142133 ms. Paused OLED refresh may appear dithered.</w:t>
-      </w:r>
-    </w:p>
-    <w:p>
-      <w:pPr>
-        <w:keepNext w:val="0"/>
-        <w:pageBreakBefore/>
-        <w:spacing w:after="120"/>
-      </w:pPr>
-      <w:r>
-        <w:rPr>
-          <w:b/>
-          <w:sz w:val="24"/>
-        </w:rPr>
-        <w:t>W-11  Offline timer completes without broker</w:t>
-      </w:r>
-    </w:p>
-    <w:p>
-      <w:pPr>
-        <w:keepNext w:val="0"/>
-        <w:spacing w:after="120"/>
-      </w:pPr>
-      <w:r>
-        <w:rPr>
-          <w:b w:val="0"/>
-          <w:sz w:val="20"/>
-        </w:rPr>
-        <w:t>Commands: CASE 11; wait &gt;8 simulator seconds. Conditions: M=50%, T=27 C, RH=60%; networking disabled.</w:t>
-      </w:r>
-    </w:p>
-    <w:p>
-      <w:pPr>
-        <w:keepNext/>
-        <w:spacing w:after="120"/>
-        <w:jc w:val="center"/>
-      </w:pPr>
-      <w:r>
-        <w:drawing>
-          <wp:inline xmlns:a="http://schemas.openxmlformats.org/drawingml/2006/main" xmlns:pic="http://schemas.openxmlformats.org/drawingml/2006/picture">
-            <wp:extent cx="8229600" cy="3936460"/>
-            <wp:docPr id="1570744411" name="Picture 1570744411" descr="Figure 25, W-11: Local 8-second accelerated dose completes while MQTT is OFF."/>
-            <wp:cNvGraphicFramePr>
-              <a:graphicFrameLocks noChangeAspect="1"/>
-            </wp:cNvGraphicFramePr>
-            <a:graphic>
-              <a:graphicData uri="http://schemas.openxmlformats.org/drawingml/2006/picture">
-                <pic:pic>
-                  <pic:nvPicPr>
-                    <pic:cNvPr id="0" name="TC11-offline-timer-completes-without-broker.jpg"/>
-                    <pic:cNvPicPr/>
-                  </pic:nvPicPr>
-                  <pic:blipFill>
-                    <a:blip r:embed="rId37"/>
-                    <a:stretch>
-                      <a:fillRect/>
-                    </a:stretch>
-                  </pic:blipFill>
-                  <pic:spPr>
-                    <a:xfrm>
-                      <a:off x="0" y="0"/>
-                      <a:ext cx="8229600" cy="3936460"/>
-                    </a:xfrm>
-                    <a:prstGeom prst="rect"/>
-                  </pic:spPr>
-                </pic:pic>
-              </a:graphicData>
-            </a:graphic>
-          </wp:inline>
-        </w:drawing>
-      </w:r>
-    </w:p>
-    <w:p>
-      <w:pPr>
-        <w:keepNext w:val="0"/>
-        <w:spacing w:after="120"/>
-      </w:pPr>
-      <w:r>
-        <w:rPr>
-          <w:b w:val="0"/>
-          <w:sz w:val="18"/>
-        </w:rPr>
-        <w:t>Figure 25: Local 8-second accelerated dose completes while MQTT is OFF. Captured command 8 min; output OFF/GPIO2 LOW; sensor VALID; alert NO; MQTT OFF. Result: PASS.</w:t>
-      </w:r>
-    </w:p>
-    <w:p>
-      <w:pPr>
-        <w:keepNext w:val="0"/>
-        <w:spacing w:after="120"/>
-      </w:pPr>
-      <w:r>
-        <w:rPr>
-          <w:b w:val="0"/>
-          <w:sz w:val="18"/>
-        </w:rPr>
-        <w:t>Source: serial/TC11-offline-timer-completes-without-broker.txt; device uptime 172029 ms. Paused OLED refresh may appear dithered.</w:t>
-      </w:r>
-    </w:p>
-    <w:p>
-      <w:pPr>
-        <w:keepNext w:val="0"/>
-        <w:pageBreakBefore/>
-        <w:spacing w:after="120"/>
-      </w:pPr>
-      <w:r>
-        <w:rPr>
-          <w:b/>
-          <w:sz w:val="24"/>
-        </w:rPr>
-        <w:t>W-12  Mqtt reconnect and receiver resumes</w:t>
-      </w:r>
-    </w:p>
-    <w:p>
-      <w:pPr>
-        <w:keepNext w:val="0"/>
-        <w:spacing w:after="120"/>
-      </w:pPr>
-      <w:r>
-        <w:rPr>
-          <w:b w:val="0"/>
-          <w:sz w:val="20"/>
-        </w:rPr>
-        <w:t>Commands: CASE 12; wait for MQTT=ON. Conditions: M=50%, T=27 C, RH=60%; networking enabled.</w:t>
-      </w:r>
-    </w:p>
-    <w:p>
-      <w:pPr>
-        <w:keepNext/>
-        <w:spacing w:after="120"/>
-        <w:jc w:val="center"/>
-      </w:pPr>
-      <w:r>
-        <w:drawing>
-          <wp:inline xmlns:a="http://schemas.openxmlformats.org/drawingml/2006/main" xmlns:pic="http://schemas.openxmlformats.org/drawingml/2006/picture">
-            <wp:extent cx="8229600" cy="3936460"/>
-            <wp:docPr id="1570744412" name="Picture 1570744412" descr="Figure 26, W-12: Broker reconnects; receiver resumes receiving snapshots."/>
-            <wp:cNvGraphicFramePr>
-              <a:graphicFrameLocks noChangeAspect="1"/>
-            </wp:cNvGraphicFramePr>
-            <a:graphic>
-              <a:graphicData uri="http://schemas.openxmlformats.org/drawingml/2006/picture">
-                <pic:pic>
-                  <pic:nvPicPr>
-                    <pic:cNvPr id="0" name="TC12-mqtt-reconnect-and-receiver-resumes.jpg"/>
-                    <pic:cNvPicPr/>
-                  </pic:nvPicPr>
-                  <pic:blipFill>
-                    <a:blip r:embed="rId38"/>
-                    <a:stretch>
-                      <a:fillRect/>
-                    </a:stretch>
-                  </pic:blipFill>
-                  <pic:spPr>
-                    <a:xfrm>
-                      <a:off x="0" y="0"/>
-                      <a:ext cx="8229600" cy="3936460"/>
-                    </a:xfrm>
-                    <a:prstGeom prst="rect"/>
-                  </pic:spPr>
-                </pic:pic>
-              </a:graphicData>
-            </a:graphic>
-          </wp:inline>
-        </w:drawing>
-      </w:r>
-    </w:p>
-    <w:p>
-      <w:pPr>
-        <w:keepNext w:val="0"/>
-        <w:spacing w:after="120"/>
-      </w:pPr>
-      <w:r>
-        <w:rPr>
-          <w:b w:val="0"/>
-          <w:sz w:val="18"/>
-        </w:rPr>
-        <w:t>Figure 26: Broker reconnects; receiver resumes receiving snapshots. Captured command 8 min; output OFF/GPIO2 LOW; sensor VALID; alert NO; MQTT ON. Result: PASS.</w:t>
-      </w:r>
-    </w:p>
-    <w:p>
-      <w:pPr>
-        <w:keepNext w:val="0"/>
-        <w:spacing w:after="120"/>
-      </w:pPr>
-      <w:r>
-        <w:rPr>
-          <w:b w:val="0"/>
-          <w:sz w:val="18"/>
-        </w:rPr>
-        <w:t>Source: serial/TC12-mqtt-reconnect-and-receiver-resumes.txt; device uptime 182309 ms. Paused OLED refresh may appear dithered.</w:t>
-      </w:r>
-    </w:p>
-    <w:p>
-      <w:pPr>
-        <w:keepNext w:val="0"/>
-        <w:pageBreakBefore/>
-        <w:spacing w:after="120"/>
-      </w:pPr>
-      <w:r>
-        <w:rPr>
-          <w:b/>
-          <w:sz w:val="24"/>
-        </w:rPr>
-        <w:t>W-13  Baseline below thirty percent</w:t>
-      </w:r>
-    </w:p>
-    <w:p>
-      <w:pPr>
-        <w:keepNext w:val="0"/>
-        <w:spacing w:after="120"/>
-      </w:pPr>
-      <w:r>
-        <w:rPr>
-          <w:b w:val="0"/>
-          <w:sz w:val="20"/>
-        </w:rPr>
-        <w:t>Commands: CASE 13. Conditions: Baseline policy; M=29%, T=27 C, RH=60%.</w:t>
-      </w:r>
-    </w:p>
-    <w:p>
-      <w:pPr>
-        <w:keepNext/>
-        <w:spacing w:after="120"/>
-        <w:jc w:val="center"/>
-      </w:pPr>
-      <w:r>
-        <w:drawing>
-          <wp:inline xmlns:a="http://schemas.openxmlformats.org/drawingml/2006/main" xmlns:pic="http://schemas.openxmlformats.org/drawingml/2006/picture">
-            <wp:extent cx="8229600" cy="3936460"/>
-            <wp:docPr id="1570744413" name="Picture 1570744413" descr="Figure 27, W-13: Threshold reference turns pump ON with 10 min command below 30%."/>
-            <wp:cNvGraphicFramePr>
-              <a:graphicFrameLocks noChangeAspect="1"/>
-            </wp:cNvGraphicFramePr>
-            <a:graphic>
-              <a:graphicData uri="http://schemas.openxmlformats.org/drawingml/2006/picture">
-                <pic:pic>
-                  <pic:nvPicPr>
-                    <pic:cNvPr id="0" name="TC13-baseline-below-thirty-percent.jpg"/>
-                    <pic:cNvPicPr/>
-                  </pic:nvPicPr>
-                  <pic:blipFill>
-                    <a:blip r:embed="rId39"/>
-                    <a:stretch>
-                      <a:fillRect/>
-                    </a:stretch>
-                  </pic:blipFill>
-                  <pic:spPr>
-                    <a:xfrm>
-                      <a:off x="0" y="0"/>
-                      <a:ext cx="8229600" cy="3936460"/>
-                    </a:xfrm>
-                    <a:prstGeom prst="rect"/>
-                  </pic:spPr>
-                </pic:pic>
-              </a:graphicData>
-            </a:graphic>
-          </wp:inline>
-        </w:drawing>
-      </w:r>
-    </w:p>
-    <w:p>
-      <w:pPr>
-        <w:keepNext w:val="0"/>
-        <w:spacing w:after="120"/>
-      </w:pPr>
-      <w:r>
-        <w:rPr>
-          <w:b w:val="0"/>
-          <w:sz w:val="18"/>
-        </w:rPr>
-        <w:t>Figure 27: Threshold reference turns pump ON with 10 min command below 30%. Captured command 10 min; output ON/GPIO2 HIGH; sensor VALID; alert YES; MQTT ON. Result: PASS.</w:t>
-      </w:r>
-    </w:p>
-    <w:p>
-      <w:pPr>
-        <w:keepNext w:val="0"/>
-        <w:spacing w:after="120"/>
-      </w:pPr>
-      <w:r>
-        <w:rPr>
-          <w:b w:val="0"/>
-          <w:sz w:val="18"/>
-        </w:rPr>
-        <w:t>Source: serial/TC13-baseline-below-thirty-percent.txt; device uptime 184593 ms. Paused OLED refresh may appear dithered.</w:t>
-      </w:r>
-    </w:p>
-    <w:p>
-      <w:pPr>
-        <w:keepNext w:val="0"/>
-        <w:pageBreakBefore/>
-        <w:spacing w:after="120"/>
-      </w:pPr>
-      <w:r>
-        <w:rPr>
-          <w:b/>
-          <w:sz w:val="24"/>
-        </w:rPr>
-        <w:t>W-14  Baseline strict boundary at thirty</w:t>
-      </w:r>
-    </w:p>
-    <w:p>
-      <w:pPr>
-        <w:keepNext w:val="0"/>
-        <w:spacing w:after="120"/>
-      </w:pPr>
-      <w:r>
-        <w:rPr>
-          <w:b w:val="0"/>
-          <w:sz w:val="20"/>
-        </w:rPr>
-        <w:t>Commands: CASE 14. Conditions: Baseline policy; M=30%, T=27 C, RH=60%.</w:t>
-      </w:r>
-    </w:p>
-    <w:p>
-      <w:pPr>
-        <w:keepNext/>
-        <w:spacing w:after="120"/>
-        <w:jc w:val="center"/>
-      </w:pPr>
-      <w:r>
-        <w:drawing>
-          <wp:inline xmlns:a="http://schemas.openxmlformats.org/drawingml/2006/main" xmlns:pic="http://schemas.openxmlformats.org/drawingml/2006/picture">
-            <wp:extent cx="8229600" cy="3936460"/>
-            <wp:docPr id="1570744414" name="Picture 1570744414" descr="Figure 28, W-14: Reference pump OFF at exactly 30%; alert remains YES (alert uses &lt;=30)."/>
-            <wp:cNvGraphicFramePr>
-              <a:graphicFrameLocks noChangeAspect="1"/>
-            </wp:cNvGraphicFramePr>
-            <a:graphic>
-              <a:graphicData uri="http://schemas.openxmlformats.org/drawingml/2006/picture">
-                <pic:pic>
-                  <pic:nvPicPr>
-                    <pic:cNvPr id="0" name="TC14-baseline-strict-boundary-at-thirty.jpg"/>
-                    <pic:cNvPicPr/>
-                  </pic:nvPicPr>
-                  <pic:blipFill>
-                    <a:blip r:embed="rId40"/>
-                    <a:stretch>
-                      <a:fillRect/>
-                    </a:stretch>
-                  </pic:blipFill>
-                  <pic:spPr>
-                    <a:xfrm>
-                      <a:off x="0" y="0"/>
-                      <a:ext cx="8229600" cy="3936460"/>
-                    </a:xfrm>
-                    <a:prstGeom prst="rect"/>
-                  </pic:spPr>
-                </pic:pic>
-              </a:graphicData>
-            </a:graphic>
-          </wp:inline>
-        </w:drawing>
-      </w:r>
-    </w:p>
-    <w:p>
-      <w:pPr>
-        <w:keepNext w:val="0"/>
-        <w:spacing w:after="120"/>
-      </w:pPr>
-      <w:r>
-        <w:rPr>
-          <w:b w:val="0"/>
-          <w:sz w:val="18"/>
-        </w:rPr>
-        <w:t>Figure 28: Reference pump OFF at exactly 30%; alert remains YES (alert uses &lt;=30). Captured command 0 min; output OFF/GPIO2 LOW; sensor VALID; alert YES; MQTT ON. Result: PASS.</w:t>
-      </w:r>
-    </w:p>
-    <w:p>
-      <w:pPr>
-        <w:keepNext w:val="0"/>
-        <w:spacing w:after="120"/>
-      </w:pPr>
-      <w:r>
-        <w:rPr>
-          <w:b w:val="0"/>
-          <w:sz w:val="18"/>
-        </w:rPr>
-        <w:t>Source: serial/TC14-baseline-strict-boundary-at-thirty.txt; device uptime 207479 ms. Paused OLED refresh may appear dithered.</w:t>
-      </w:r>
-    </w:p>
-    <w:p>
-      <w:pPr>
-        <w:keepNext w:val="0"/>
-        <w:pageBreakBefore/>
-        <w:spacing w:after="120"/>
-      </w:pPr>
-      <w:r>
-        <w:rPr>
-          <w:b/>
-          <w:sz w:val="24"/>
-        </w:rPr>
-        <w:t>W-15  Timer expiry no repeated sample restart</w:t>
-      </w:r>
-    </w:p>
-    <w:p>
-      <w:pPr>
-        <w:keepNext w:val="0"/>
-        <w:spacing w:after="120"/>
-      </w:pPr>
-      <w:r>
-        <w:rPr>
-          <w:b w:val="0"/>
-          <w:sz w:val="20"/>
-        </w:rPr>
-        <w:t>Commands: CASE 15; wait &gt;8 and &lt;60 simulator seconds. Conditions: M=50%, T=27 C, RH=60%.</w:t>
-      </w:r>
-    </w:p>
-    <w:p>
-      <w:pPr>
-        <w:keepNext/>
-        <w:spacing w:after="120"/>
-        <w:jc w:val="center"/>
-      </w:pPr>
-      <w:r>
-        <w:drawing>
-          <wp:inline xmlns:a="http://schemas.openxmlformats.org/drawingml/2006/main" xmlns:pic="http://schemas.openxmlformats.org/drawingml/2006/picture">
-            <wp:extent cx="8229600" cy="3936460"/>
-            <wp:docPr id="1570744415" name="Picture 1570744415" descr="Figure 29, W-15: 8-second dose expires; subsequent 5-second samples do not restart it."/>
-            <wp:cNvGraphicFramePr>
-              <a:graphicFrameLocks noChangeAspect="1"/>
-            </wp:cNvGraphicFramePr>
-            <a:graphic>
-              <a:graphicData uri="http://schemas.openxmlformats.org/drawingml/2006/picture">
-                <pic:pic>
-                  <pic:nvPicPr>
-                    <pic:cNvPr id="0" name="TC15-timer-expiry-no-repeated-sample-restar.jpg"/>
-                    <pic:cNvPicPr/>
-                  </pic:nvPicPr>
-                  <pic:blipFill>
-                    <a:blip r:embed="rId41"/>
-                    <a:stretch>
-                      <a:fillRect/>
-                    </a:stretch>
-                  </pic:blipFill>
-                  <pic:spPr>
-                    <a:xfrm>
-                      <a:off x="0" y="0"/>
-                      <a:ext cx="8229600" cy="3936460"/>
-                    </a:xfrm>
-                    <a:prstGeom prst="rect"/>
-                  </pic:spPr>
-                </pic:pic>
-              </a:graphicData>
-            </a:graphic>
-          </wp:inline>
-        </w:drawing>
-      </w:r>
-    </w:p>
-    <w:p>
-      <w:pPr>
-        <w:keepNext w:val="0"/>
-        <w:spacing w:after="120"/>
-      </w:pPr>
-      <w:r>
-        <w:rPr>
-          <w:b w:val="0"/>
-          <w:sz w:val="18"/>
-        </w:rPr>
-        <w:t>Figure 29: 8-second dose expires; subsequent 5-second samples do not restart it. Captured command 8 min; output OFF/GPIO2 LOW; sensor VALID; alert NO; MQTT ON. Result: PASS.</w:t>
-      </w:r>
-    </w:p>
-    <w:p>
-      <w:pPr>
-        <w:keepNext w:val="0"/>
-        <w:spacing w:after="120"/>
-      </w:pPr>
-      <w:r>
-        <w:rPr>
-          <w:b w:val="0"/>
-          <w:sz w:val="18"/>
-        </w:rPr>
-        <w:t>Source: serial/TC15-timer-expiry-no-repeated-sample-restar.txt; device uptime 232597 ms. Paused OLED refresh may appear dithered.</w:t>
-      </w:r>
-    </w:p>
-    <w:p>
-      <w:pPr>
-        <w:keepNext w:val="0"/>
-        <w:pageBreakBefore/>
-        <w:spacing w:after="120"/>
-      </w:pPr>
-      <w:r>
-        <w:rPr>
-          <w:b/>
-          <w:sz w:val="24"/>
-        </w:rPr>
-        <w:t>W-16  Out of range input rejected</w:t>
-      </w:r>
-    </w:p>
-    <w:p>
-      <w:pPr>
-        <w:keepNext w:val="0"/>
-        <w:spacing w:after="120"/>
-      </w:pPr>
-      <w:r>
-        <w:rPr>
-          <w:b w:val="0"/>
-          <w:sz w:val="20"/>
-        </w:rPr>
-        <w:t>Commands: CASE 16; SET 101 27 60; STATUS. Conditions: Start at M=50%, T=27 C, RH=60%.</w:t>
-      </w:r>
-    </w:p>
-    <w:p>
-      <w:pPr>
-        <w:keepNext/>
-        <w:spacing w:after="120"/>
-        <w:jc w:val="center"/>
-      </w:pPr>
-      <w:r>
-        <w:drawing>
-          <wp:inline xmlns:a="http://schemas.openxmlformats.org/drawingml/2006/main" xmlns:pic="http://schemas.openxmlformats.org/drawingml/2006/picture">
-            <wp:extent cx="8229600" cy="3936460"/>
-            <wp:docPr id="1570744416" name="Picture 1570744416" descr="Figure 30, W-16: Out-of-domain SET is rejected; previous valid input and command remain."/>
-            <wp:cNvGraphicFramePr>
-              <a:graphicFrameLocks noChangeAspect="1"/>
-            </wp:cNvGraphicFramePr>
-            <a:graphic>
-              <a:graphicData uri="http://schemas.openxmlformats.org/drawingml/2006/picture">
-                <pic:pic>
-                  <pic:nvPicPr>
-                    <pic:cNvPr id="0" name="TC16-out-of-range-input-rejected.jpg"/>
-                    <pic:cNvPicPr/>
-                  </pic:nvPicPr>
-                  <pic:blipFill>
-                    <a:blip r:embed="rId42"/>
-                    <a:stretch>
-                      <a:fillRect/>
-                    </a:stretch>
-                  </pic:blipFill>
-                  <pic:spPr>
-                    <a:xfrm>
-                      <a:off x="0" y="0"/>
-                      <a:ext cx="8229600" cy="3936460"/>
-                    </a:xfrm>
-                    <a:prstGeom prst="rect"/>
-                  </pic:spPr>
-                </pic:pic>
-              </a:graphicData>
-            </a:graphic>
-          </wp:inline>
-        </w:drawing>
-      </w:r>
-    </w:p>
-    <w:p>
-      <w:pPr>
-        <w:keepNext w:val="0"/>
-        <w:spacing w:after="120"/>
-      </w:pPr>
-      <w:r>
-        <w:rPr>
-          <w:b w:val="0"/>
-          <w:sz w:val="18"/>
-        </w:rPr>
-        <w:t>Figure 30: Out-of-domain SET is rejected; previous valid input and command remain. Captured command 8 min; output ON/GPIO2 HIGH; sensor VALID; alert NO; MQTT ON. Result: PASS. The raw record also contains: “REJECTED use moisture 0..100, temp 0..50, humidity 0..100”.</w:t>
-      </w:r>
-    </w:p>
-    <w:p>
-      <w:pPr>
-        <w:keepNext w:val="0"/>
-        <w:spacing w:after="120"/>
-      </w:pPr>
-      <w:r>
-        <w:rPr>
-          <w:b w:val="0"/>
-          <w:sz w:val="18"/>
-        </w:rPr>
-        <w:t>Source: serial/TC16-out-of-range-input-rejected.txt; device uptime 232776 ms. Paused OLED refresh may appear dithered.</w:t>
-      </w:r>
-    </w:p>
-    <w:p>
-      <w:pPr>
-        <w:keepNext w:val="0"/>
-        <w:pageBreakBefore/>
-        <w:spacing w:after="120"/>
-      </w:pPr>
-      <w:r>
-        <w:rPr>
-          <w:b/>
-          <w:sz w:val="24"/>
-        </w:rPr>
-        <w:t>W-17  Raw wet step stops active dose</w:t>
-      </w:r>
-    </w:p>
-    <w:p>
-      <w:pPr>
-        <w:keepNext w:val="0"/>
-        <w:spacing w:after="120"/>
-      </w:pPr>
-      <w:r>
-        <w:rPr>
-          <w:b w:val="0"/>
-          <w:sz w:val="20"/>
-        </w:rPr>
-        <w:t>Commands: CASE 17; STEP 90 45 20 while pump is ON. Conditions: Initial M=10%, T=45 C, RH=20%.</w:t>
-      </w:r>
-    </w:p>
-    <w:p>
-      <w:pPr>
-        <w:keepNext/>
-        <w:spacing w:after="120"/>
-        <w:jc w:val="center"/>
-      </w:pPr>
-      <w:r>
-        <w:drawing>
-          <wp:inline xmlns:a="http://schemas.openxmlformats.org/drawingml/2006/main" xmlns:pic="http://schemas.openxmlformats.org/drawingml/2006/picture">
-            <wp:extent cx="8229600" cy="3936460"/>
-            <wp:docPr id="1570744417" name="Picture 1570744417" descr="Figure 31, W-17: Raw wet reading stops output even while filtered moisture remains below 80%."/>
-            <wp:cNvGraphicFramePr>
-              <a:graphicFrameLocks noChangeAspect="1"/>
-            </wp:cNvGraphicFramePr>
-            <a:graphic>
-              <a:graphicData uri="http://schemas.openxmlformats.org/drawingml/2006/picture">
-                <pic:pic>
-                  <pic:nvPicPr>
-                    <pic:cNvPr id="0" name="TC17-raw-wet-step-stops-active-dose.jpg"/>
-                    <pic:cNvPicPr/>
-                  </pic:nvPicPr>
-                  <pic:blipFill>
-                    <a:blip r:embed="rId43"/>
-                    <a:stretch>
-                      <a:fillRect/>
-                    </a:stretch>
-                  </pic:blipFill>
-                  <pic:spPr>
-                    <a:xfrm>
-                      <a:off x="0" y="0"/>
-                      <a:ext cx="8229600" cy="3936460"/>
-                    </a:xfrm>
-                    <a:prstGeom prst="rect"/>
-                  </pic:spPr>
-                </pic:pic>
-              </a:graphicData>
-            </a:graphic>
-          </wp:inline>
-        </w:drawing>
-      </w:r>
-    </w:p>
-    <w:p>
-      <w:pPr>
-        <w:keepNext w:val="0"/>
-        <w:spacing w:after="120"/>
-      </w:pPr>
-      <w:r>
-        <w:rPr>
-          <w:b w:val="0"/>
-          <w:sz w:val="18"/>
-        </w:rPr>
-        <w:t>Figure 31: Raw wet reading stops output even while filtered moisture remains below 80%. Captured command 7.3333 min; output OFF/GPIO2 LOW; sensor VALID; alert NO; MQTT ON. Result: PASS.</w:t>
-      </w:r>
-    </w:p>
-    <w:p>
-      <w:pPr>
-        <w:keepNext w:val="0"/>
-        <w:spacing w:after="120"/>
-      </w:pPr>
-      <w:r>
-        <w:rPr>
-          <w:b w:val="0"/>
-          <w:sz w:val="18"/>
-        </w:rPr>
-        <w:t>Source: serial/TC17-raw-wet-step-stops-active-dose.txt; device uptime 251418 ms. Paused OLED refresh may appear dithered.</w:t>
-      </w:r>
-    </w:p>
-    <w:p>
-      <w:pPr>
-        <w:keepNext w:val="0"/>
-        <w:pageBreakBefore/>
-        <w:spacing w:after="120"/>
-      </w:pPr>
-      <w:r>
-        <w:rPr>
-          <w:b/>
-          <w:sz w:val="24"/>
-        </w:rPr>
-        <w:t>W-18  Filter settles after five samples</w:t>
-      </w:r>
-    </w:p>
-    <w:p>
-      <w:pPr>
-        <w:keepNext w:val="0"/>
-        <w:spacing w:after="120"/>
-      </w:pPr>
-      <w:r>
-        <w:rPr>
-          <w:b w:val="0"/>
-          <w:sz w:val="20"/>
-        </w:rPr>
-        <w:t>Commands: CASE 18; wait &gt;=5 samples; STEP 0 27 60. Conditions: Initial M=100%, T=27 C, RH=60%.</w:t>
-      </w:r>
-    </w:p>
-    <w:p>
-      <w:pPr>
-        <w:keepNext/>
-        <w:spacing w:after="120"/>
-        <w:jc w:val="center"/>
-      </w:pPr>
-      <w:r>
-        <w:drawing>
-          <wp:inline xmlns:a="http://schemas.openxmlformats.org/drawingml/2006/main" xmlns:pic="http://schemas.openxmlformats.org/drawingml/2006/picture">
-            <wp:extent cx="8229600" cy="3936460"/>
-            <wp:docPr id="1570744418" name="Picture 1570744418" descr="Figure 32, W-18: Five-sample response: 80, 60, 40, 20, 0%; settled command 26 min. Pump remains OFF until a new dose window."/>
-            <wp:cNvGraphicFramePr>
-              <a:graphicFrameLocks noChangeAspect="1"/>
-            </wp:cNvGraphicFramePr>
-            <a:graphic>
-              <a:graphicData uri="http://schemas.openxmlformats.org/drawingml/2006/picture">
-                <pic:pic>
-                  <pic:nvPicPr>
-                    <pic:cNvPr id="0" name="TC18-filter-settles-after-five-samples.jpg"/>
-                    <pic:cNvPicPr/>
-                  </pic:nvPicPr>
-                  <pic:blipFill>
-                    <a:blip r:embed="rId44"/>
-                    <a:stretch>
-                      <a:fillRect/>
-                    </a:stretch>
-                  </pic:blipFill>
-                  <pic:spPr>
-                    <a:xfrm>
-                      <a:off x="0" y="0"/>
-                      <a:ext cx="8229600" cy="3936460"/>
-                    </a:xfrm>
-                    <a:prstGeom prst="rect"/>
-                  </pic:spPr>
-                </pic:pic>
-              </a:graphicData>
-            </a:graphic>
-          </wp:inline>
-        </w:drawing>
-      </w:r>
-    </w:p>
-    <w:p>
-      <w:pPr>
-        <w:keepNext w:val="0"/>
-        <w:spacing w:after="120"/>
-      </w:pPr>
-      <w:r>
-        <w:rPr>
-          <w:b w:val="0"/>
-          <w:sz w:val="18"/>
-        </w:rPr>
-        <w:t>Figure 32: Five-sample response: 80, 60, 40, 20, 0%; settled command 26 min. Pump remains OFF until a new dose window. Captured command 26 min; output OFF/GPIO2 LOW; sensor VALID; alert YES; MQTT ON. Result: PASS. The captured output is OFF after an accelerated dose; a nonzero command is not an immediate pump-start request.</w:t>
-      </w:r>
-    </w:p>
-    <w:p>
-      <w:pPr>
-        <w:keepNext w:val="0"/>
-        <w:spacing w:after="120"/>
-      </w:pPr>
-      <w:r>
-        <w:rPr>
-          <w:b w:val="0"/>
-          <w:sz w:val="18"/>
-        </w:rPr>
-        <w:t>Source: serial/TC18-filter-settles-after-five-samples.txt; device uptime 427772 ms. Paused OLED refresh may appear dithered.</w:t>
-      </w:r>
-    </w:p>
-    <w:p>
-      <w:pPr>
-        <w:keepNext w:val="0"/>
-        <w:pageBreakBefore/>
-        <w:spacing w:after="120"/>
-      </w:pPr>
-      <w:r>
-        <w:rPr>
-          <w:b/>
-          <w:sz w:val="24"/>
-        </w:rPr>
-        <w:t>W-18 intermediate filter response</w:t>
-      </w:r>
-    </w:p>
-    <w:p>
-      <w:pPr>
-        <w:keepNext/>
-        <w:spacing w:after="120"/>
-        <w:jc w:val="center"/>
-      </w:pPr>
-      <w:r>
-        <w:drawing>
-          <wp:inline xmlns:a="http://schemas.openxmlformats.org/drawingml/2006/main" xmlns:pic="http://schemas.openxmlformats.org/drawingml/2006/picture">
-            <wp:extent cx="8229600" cy="3936460"/>
-            <wp:docPr id="1570744419" name="Picture 1570744419" descr="After a filled 100% window, STEP 0 27 60 gives raw moisture 0% and an initial average of 80%. This frame is from a separate framing repeat counted once within W-18. The settled-case record preserves the full 80, 60, 40, 20, 0% sequence."/>
-            <wp:cNvGraphicFramePr>
-              <a:graphicFrameLocks noChangeAspect="1"/>
-            </wp:cNvGraphicFramePr>
-            <a:graphic>
-              <a:graphicData uri="http://schemas.openxmlformats.org/drawingml/2006/picture">
-                <pic:pic>
-                  <pic:nvPicPr>
-                    <pic:cNvPr id="0" name="TC18-filter-intermediate.jpg"/>
-                    <pic:cNvPicPr/>
-                  </pic:nvPicPr>
-                  <pic:blipFill>
-                    <a:blip r:embed="rId45"/>
-                    <a:stretch>
-                      <a:fillRect/>
-                    </a:stretch>
-                  </pic:blipFill>
-                  <pic:spPr>
-                    <a:xfrm>
-                      <a:off x="0" y="0"/>
-                      <a:ext cx="8229600" cy="3936460"/>
-                    </a:xfrm>
-                    <a:prstGeom prst="rect"/>
-                  </pic:spPr>
-                </pic:pic>
-              </a:graphicData>
-            </a:graphic>
-          </wp:inline>
-        </w:drawing>
-      </w:r>
-    </w:p>
-    <w:p>
-      <w:pPr>
-        <w:keepNext w:val="0"/>
-        <w:spacing w:after="120"/>
-      </w:pPr>
-      <w:r>
-        <w:rPr>
-          <w:b w:val="0"/>
-          <w:sz w:val="20"/>
-        </w:rPr>
-        <w:t>Figure 33: After a filled 100% window, STEP 0 27 60 gives raw moisture 0% and an initial average of 80%. This frame is from a separate framing repeat counted once within W-18. The settled-case record preserves the full 80, 60, 40, 20, 0% sequence.</w:t>
-      </w:r>
-    </w:p>
-    <w:p>
-      <w:pPr>
-        <w:keepNext w:val="0"/>
-        <w:spacing w:after="120"/>
-      </w:pPr>
-      <w:r>
-        <w:rPr>
-          <w:b w:val="0"/>
-          <w:sz w:val="18"/>
-        </w:rPr>
-        <w:t>Source: serial/TC18-filter-intermediate.txt.</w:t>
-      </w:r>
-    </w:p>
-    <w:p>
-      <w:pPr>
-        <w:keepNext w:val="0"/>
-        <w:pageBreakBefore/>
-        <w:spacing w:after="120"/>
-      </w:pPr>
-      <w:r>
-        <w:rPr>
-          <w:b/>
-          <w:sz w:val="24"/>
-        </w:rPr>
-        <w:t>LIVE DHT22 and ADC model readings</w:t>
-      </w:r>
-    </w:p>
-    <w:p>
-      <w:pPr>
-        <w:keepNext/>
-        <w:spacing w:after="120"/>
-        <w:jc w:val="center"/>
-      </w:pPr>
-      <w:r>
-        <w:drawing>
-          <wp:inline xmlns:a="http://schemas.openxmlformats.org/drawingml/2006/main" xmlns:pic="http://schemas.openxmlformats.org/drawingml/2006/picture">
-            <wp:extent cx="8229600" cy="3936460"/>
-            <wp:docPr id="1570744420" name="Picture 1570744420" descr="LIVE uses Wokwi DHT22 and potentiometer readings: 27°C, 60% RH and approximately 50.06% moisture, yielding 7.9837 command min. The preceding TC18 label persists; FUZZY / LIVE identifies the input source. The pump is OFF after the accelerated dose. These are virtual component readings, not field measurements."/>
-            <wp:cNvGraphicFramePr>
-              <a:graphicFrameLocks noChangeAspect="1"/>
-            </wp:cNvGraphicFramePr>
-            <a:graphic>
-              <a:graphicData uri="http://schemas.openxmlformats.org/drawingml/2006/picture">
-                <pic:pic>
-                  <pic:nvPicPr>
-                    <pic:cNvPr id="0" name="HW01-live-model-inputs.jpg"/>
-                    <pic:cNvPicPr/>
-                  </pic:nvPicPr>
-                  <pic:blipFill>
-                    <a:blip r:embed="rId46"/>
-                    <a:stretch>
-                      <a:fillRect/>
-                    </a:stretch>
-                  </pic:blipFill>
-                  <pic:spPr>
-                    <a:xfrm>
-                      <a:off x="0" y="0"/>
-                      <a:ext cx="8229600" cy="3936460"/>
-                    </a:xfrm>
-                    <a:prstGeom prst="rect"/>
-                  </pic:spPr>
-                </pic:pic>
-              </a:graphicData>
-            </a:graphic>
-          </wp:inline>
-        </w:drawing>
-      </w:r>
-    </w:p>
-    <w:p>
-      <w:pPr>
-        <w:keepNext w:val="0"/>
-        <w:spacing w:after="120"/>
-      </w:pPr>
-      <w:r>
-        <w:rPr>
-          <w:b w:val="0"/>
-          <w:sz w:val="20"/>
-        </w:rPr>
-        <w:t>Figure 34: LIVE uses Wokwi DHT22 and potentiometer readings: 27°C, 60% RH and approximately 50.06% moisture, yielding 7.9837 command min. The preceding TC18 label persists; FUZZY / LIVE identifies the input source. The pump is OFF after the accelerated dose. These are virtual component readings, not field measurements.</w:t>
-      </w:r>
-    </w:p>
-    <w:p>
-      <w:pPr>
-        <w:keepNext w:val="0"/>
-        <w:spacing w:after="120"/>
-      </w:pPr>
-      <w:r>
-        <w:rPr>
-          <w:b w:val="0"/>
-          <w:sz w:val="18"/>
-        </w:rPr>
-        <w:t>Source: serial/HW01-live-model-inputs.txt.</w:t>
-      </w:r>
-    </w:p>
-    <w:p>
-      <w:pPr>
-        <w:keepNext w:val="0"/>
-        <w:spacing w:after="0" w:before="0"/>
-        <w:sectPr>
-          <w:type w:val="nextPage"/>
-          <w:pgSz w:w="15840" w:h="12240" w:orient="landscape"/>
-          <w:pgMar w:top="1440" w:right="1440" w:bottom="1440" w:left="1440" w:header="708" w:footer="708" w:gutter="0"/>
-          <w:cols w:space="720"/>
-          <w:docGrid w:linePitch="360"/>
-        </w:sectPr>
-      </w:pPr>
     </w:p>
     <w:p>
       <w:pPr>
@@ -18601,7 +15955,7 @@
           <w:sz w:val="22"/>
           <w:szCs w:val="22"/>
         </w:rPr>
-        <w:t>The SmartAgri application and browser experiment are archived on branch codex/dashboard-design at commit c74c049e1c3bd35b2e8d45fa087b26839b8c3107 [15]. The browser package SmartAgri-Complete-Simulation.zip contains source, model metadata, dataset hash, nine JSON/CSV traces and screenshot manifest. The separate SmartAgri-Wokwi-Test-Evidence.zip contains the tested four Wokwi files, all 18 case records, 20 unaltered screenshots, MQTT JSONL/CSV, source hashes and reproduction commands. These local Wokwi artifacts accompany the paper; they are not represented as part of the cited Git commit. All reported operational evidence is simulated; no physical breadboard or hydraulic dataset is included.</w:t>
+        <w:t>The complete implementation and experimental evidence are publicly archived in the SmartAgri repository at commit 42bb940a0102c4b141964a97dc49e9ccb60d3eb1 [15]. The simulator folders contain source, model metadata, dataset hash, nine browser JSON/CSV traces and screenshot manifests. The wokwi and docs/wokwi-evidence folders contain the tested firmware, circuit, 18 case records, 20 unaltered circuit-and-Serial screenshots, MQTT JSONL/CSV, source hashes and reproduction commands. The companion supplementary Word document presents the full screenshot evidence. All reported operational evidence is simulated; no physical breadboard or hydraulic dataset is included.</w:t>
       </w:r>
     </w:p>
     <w:p>
@@ -18632,7 +15986,356 @@
         </w:rPr>
       </w:pPr>
       <w:r>
-        <w:t xml:space="preserve">Tested Wokwi project [16]: </w:t>
+        <w:t>Tested Wokwi project [16]: https://wokwi.com/projects/478323582523545601. The saved project and its sketch/diagram were reopened and checked after the test session on October 25, 2026. Case protocols and selected results are given in Table 6a and the supplementary test-case document.</w:t>
+      </w:r>
+    </w:p>
+    <w:p>
+      <w:pPr>
+        <w:pStyle w:val="Heading1"/>
+        <w:keepNext/>
+        <w:widowControl/>
+        <w:spacing w:before="240" w:after="120"/>
+        <w:rPr>
+          <w:b/>
+          <w:bCs/>
+          <w:color w:val="000000" w:themeColor="text1"/>
+          <w:sz w:val="28"/>
+          <w:szCs w:val="28"/>
+        </w:rPr>
+      </w:pPr>
+      <w:r>
+        <w:rPr>
+          <w:b/>
+          <w:bCs/>
+          <w:color w:val="000000"/>
+          <w:sz w:val="28"/>
+          <w:szCs w:val="28"/>
+        </w:rPr>
+        <w:lastRenderedPageBreak/>
+        <w:t>References</w:t>
+      </w:r>
+    </w:p>
+    <w:p>
+      <w:pPr>
+        <w:keepNext w:val="0"/>
+        <w:widowControl/>
+        <w:spacing w:before="240" w:after="140"/>
+        <w:rPr>
+          <w:color w:val="000000" w:themeColor="text1"/>
+          <w:sz w:val="22"/>
+          <w:szCs w:val="22"/>
+        </w:rPr>
+      </w:pPr>
+      <w:r>
+        <w:rPr>
+          <w:b w:val="0"/>
+          <w:color w:val="000000" w:themeColor="text1"/>
+          <w:sz w:val="20"/>
+          <w:szCs w:val="22"/>
+        </w:rPr>
+        <w:t>[1] K. G. Liakos, P. Busato, D. Moshou, S. Pearson, and D. Bochtis, “Machine Learning in Agriculture: A Review,” Sensors, vol. 18, no. 8, art. 2674, 2018. https://doi.org/10.3390/s18082674</w:t>
+      </w:r>
+    </w:p>
+    <w:p>
+      <w:pPr>
+        <w:keepNext w:val="0"/>
+        <w:widowControl/>
+        <w:spacing w:before="240" w:after="140"/>
+        <w:rPr>
+          <w:color w:val="000000" w:themeColor="text1"/>
+          <w:sz w:val="22"/>
+          <w:szCs w:val="22"/>
+        </w:rPr>
+      </w:pPr>
+      <w:r>
+        <w:rPr>
+          <w:b w:val="0"/>
+          <w:color w:val="000000" w:themeColor="text1"/>
+          <w:sz w:val="20"/>
+          <w:szCs w:val="22"/>
+        </w:rPr>
+        <w:t>[2] G. P. Pereira, M. Z. Chaari, and F. Daroge, “IoT-Enabled Smart Drip Irrigation System Using ESP32,” IoT, vol. 4, no. 3, pp. 221–243, 2023. https://doi.org/10.3390/iot4030012</w:t>
+      </w:r>
+    </w:p>
+    <w:p>
+      <w:pPr>
+        <w:keepNext w:val="0"/>
+        <w:widowControl/>
+        <w:spacing w:before="240" w:after="140"/>
+        <w:rPr>
+          <w:color w:val="000000" w:themeColor="text1"/>
+          <w:sz w:val="22"/>
+          <w:szCs w:val="22"/>
+        </w:rPr>
+      </w:pPr>
+      <w:r>
+        <w:rPr>
+          <w:b w:val="0"/>
+          <w:color w:val="000000" w:themeColor="text1"/>
+          <w:sz w:val="20"/>
+          <w:szCs w:val="22"/>
+        </w:rPr>
+        <w:t>[3] M. K. Senapaty, A. Ray, and N. Padhy, “A Decision Support System for Crop Recommendation Using Machine Learning Classification Algorithms,” Agriculture, vol. 14, no. 8, art. 1256, 2024. https://doi.org/10.3390/agriculture14081256</w:t>
+      </w:r>
+    </w:p>
+    <w:p>
+      <w:pPr>
+        <w:keepNext w:val="0"/>
+        <w:widowControl/>
+        <w:spacing w:before="240" w:after="140"/>
+        <w:rPr>
+          <w:color w:val="000000" w:themeColor="text1"/>
+          <w:sz w:val="22"/>
+          <w:szCs w:val="22"/>
+        </w:rPr>
+      </w:pPr>
+      <w:r>
+        <w:rPr>
+          <w:b w:val="0"/>
+          <w:color w:val="000000" w:themeColor="text1"/>
+          <w:sz w:val="20"/>
+          <w:szCs w:val="22"/>
+        </w:rPr>
+        <w:t>[4] P. Wijayakusuma, G. P. N. Hakim, and B. Li, “TerraGrow: Integrated platform for real time plant monitoring and automated watering system with IoT and fuzzy Sugeno Algorithm,” HardwareX, vol. 24, art. e00724, 2025. https://doi.org/10.1016/j.ohx.2025.e00724</w:t>
+      </w:r>
+    </w:p>
+    <w:p>
+      <w:pPr>
+        <w:keepNext w:val="0"/>
+        <w:widowControl/>
+        <w:spacing w:before="240" w:after="140"/>
+        <w:rPr>
+          <w:color w:val="000000" w:themeColor="text1"/>
+          <w:sz w:val="22"/>
+          <w:szCs w:val="22"/>
+        </w:rPr>
+      </w:pPr>
+      <w:r>
+        <w:rPr>
+          <w:b w:val="0"/>
+          <w:color w:val="000000" w:themeColor="text1"/>
+          <w:sz w:val="20"/>
+          <w:szCs w:val="22"/>
+        </w:rPr>
+        <w:t>[5] A. Cartolano, A. Cuzzocrea, and G. Pilato, “Analyzing and assessing explainable AI models for smart agriculture environments,” Multimedia Tools and Applications, vol. 83, no. 12, pp. 37225–37246, 2024. https://doi.org/10.1007/s11042-023-17978-z</w:t>
+      </w:r>
+    </w:p>
+    <w:p>
+      <w:pPr>
+        <w:keepNext w:val="0"/>
+        <w:widowControl/>
+        <w:spacing w:before="240" w:after="140"/>
+        <w:rPr>
+          <w:color w:val="000000" w:themeColor="text1"/>
+          <w:sz w:val="22"/>
+          <w:szCs w:val="22"/>
+        </w:rPr>
+      </w:pPr>
+      <w:r>
+        <w:rPr>
+          <w:b w:val="0"/>
+          <w:color w:val="000000" w:themeColor="text1"/>
+          <w:sz w:val="20"/>
+          <w:szCs w:val="22"/>
+        </w:rPr>
+        <w:t>[6] L. Breiman, “Random Forests,” Machine Learning, vol. 45, no. 1, pp. 5–32, 2001. https://doi.org/10.1023/A:1010933404324</w:t>
+      </w:r>
+    </w:p>
+    <w:p>
+      <w:pPr>
+        <w:keepNext w:val="0"/>
+        <w:widowControl/>
+        <w:spacing w:before="240" w:after="140"/>
+        <w:rPr>
+          <w:color w:val="000000" w:themeColor="text1"/>
+          <w:sz w:val="22"/>
+          <w:szCs w:val="22"/>
+        </w:rPr>
+      </w:pPr>
+      <w:r>
+        <w:rPr>
+          <w:b w:val="0"/>
+          <w:color w:val="000000" w:themeColor="text1"/>
+          <w:sz w:val="20"/>
+          <w:szCs w:val="22"/>
+        </w:rPr>
+        <w:t>[7] S. M. Lundberg and S.-I. Lee, “A Unified Approach to Interpreting Model Predictions,” Advances in Neural Information Processing Systems, vol. 30, pp. 4765–4774, 2017. https://proceedings.neurips.cc/paper/2017/hash/8a20a8621978632d76c43dfd28b67767-Abstract.html</w:t>
+      </w:r>
+    </w:p>
+    <w:p>
+      <w:pPr>
+        <w:keepNext w:val="0"/>
+        <w:widowControl/>
+        <w:spacing w:before="240" w:after="140"/>
+        <w:rPr>
+          <w:color w:val="000000" w:themeColor="text1"/>
+          <w:sz w:val="22"/>
+          <w:szCs w:val="22"/>
+        </w:rPr>
+      </w:pPr>
+      <w:r>
+        <w:rPr>
+          <w:b w:val="0"/>
+          <w:color w:val="000000" w:themeColor="text1"/>
+          <w:sz w:val="20"/>
+          <w:szCs w:val="22"/>
+        </w:rPr>
+        <w:t>[8] MathWorks, “Mamdani and Sugeno Fuzzy Inference Systems,” Fuzzy Logic Toolbox documentation. https://www.mathworks.com/help/fuzzy/types-of-fuzzy-inference-systems.html (accessed October 19, 2026).</w:t>
+      </w:r>
+    </w:p>
+    <w:p>
+      <w:pPr>
+        <w:keepNext w:val="0"/>
+        <w:widowControl/>
+        <w:spacing w:before="240" w:after="140"/>
+        <w:rPr>
+          <w:color w:val="000000" w:themeColor="text1"/>
+          <w:sz w:val="22"/>
+          <w:szCs w:val="22"/>
+        </w:rPr>
+      </w:pPr>
+      <w:r>
+        <w:rPr>
+          <w:b w:val="0"/>
+          <w:color w:val="000000" w:themeColor="text1"/>
+          <w:sz w:val="20"/>
+          <w:szCs w:val="22"/>
+        </w:rPr>
+        <w:t>[9] A. Banks and R. Gupta, Eds., MQTT Version 3.1.1, OASIS Standard, October 29, 2014. https://docs.oasis-open.org/mqtt/mqtt/v3.1.1/os/mqtt-v3.1.1-os.html</w:t>
+      </w:r>
+    </w:p>
+    <w:p>
+      <w:pPr>
+        <w:keepNext w:val="0"/>
+        <w:widowControl/>
+        <w:spacing w:before="240" w:after="140"/>
+        <w:rPr>
+          <w:color w:val="000000" w:themeColor="text1"/>
+          <w:sz w:val="22"/>
+          <w:szCs w:val="22"/>
+        </w:rPr>
+      </w:pPr>
+      <w:r>
+        <w:rPr>
+          <w:b w:val="0"/>
+          <w:color w:val="000000" w:themeColor="text1"/>
+          <w:sz w:val="20"/>
+          <w:szCs w:val="22"/>
+        </w:rPr>
+        <w:t>[10] Wokwi, “wokwi-dht22 Reference,” Wokwi Docs. https://docs.wokwi.com/parts/wokwi-dht22 (accessed October 19, 2026).</w:t>
+      </w:r>
+    </w:p>
+    <w:p>
+      <w:pPr>
+        <w:keepNext w:val="0"/>
+        <w:widowControl/>
+        <w:spacing w:before="240" w:after="140"/>
+        <w:rPr>
+          <w:color w:val="000000" w:themeColor="text1"/>
+          <w:sz w:val="22"/>
+          <w:szCs w:val="22"/>
+        </w:rPr>
+      </w:pPr>
+      <w:r>
+        <w:rPr>
+          <w:b w:val="0"/>
+          <w:color w:val="000000" w:themeColor="text1"/>
+          <w:sz w:val="20"/>
+          <w:szCs w:val="22"/>
+        </w:rPr>
+        <w:t>[11] Wokwi, “wokwi-ssd1306 Reference,” Wokwi Docs. https://docs.wokwi.com/parts/wokwi-ssd1306 (accessed October 19, 2026).</w:t>
+      </w:r>
+    </w:p>
+    <w:p>
+      <w:pPr>
+        <w:keepNext w:val="0"/>
+        <w:widowControl/>
+        <w:spacing w:before="240" w:after="140"/>
+        <w:rPr>
+          <w:color w:val="000000" w:themeColor="text1"/>
+          <w:sz w:val="22"/>
+          <w:szCs w:val="22"/>
+        </w:rPr>
+      </w:pPr>
+      <w:r>
+        <w:rPr>
+          <w:b w:val="0"/>
+          <w:color w:val="000000" w:themeColor="text1"/>
+          <w:sz w:val="20"/>
+          <w:szCs w:val="22"/>
+        </w:rPr>
+        <w:t>[12] Adafruit, “DHT11, DHT22 and AM2302 Sensors: Overview,” Adafruit Learning System. https://learn.adafruit.com/dht/overview (accessed October 19, 2026).</w:t>
+      </w:r>
+    </w:p>
+    <w:p>
+      <w:pPr>
+        <w:keepNext w:val="0"/>
+        <w:widowControl/>
+        <w:spacing w:before="240" w:after="140"/>
+        <w:rPr>
+          <w:color w:val="000000" w:themeColor="text1"/>
+          <w:sz w:val="22"/>
+          <w:szCs w:val="22"/>
+        </w:rPr>
+      </w:pPr>
+      <w:r>
+        <w:rPr>
+          <w:b w:val="0"/>
+          <w:color w:val="000000" w:themeColor="text1"/>
+          <w:sz w:val="20"/>
+          <w:szCs w:val="22"/>
+        </w:rPr>
+        <w:t>[13] scikit-learn developers, “Cross-validation: evaluating estimator performance,” scikit-learn User Guide. https://scikit-learn.org/stable/modules/cross_validation.html (accessed October 19, 2026).</w:t>
+      </w:r>
+    </w:p>
+    <w:p>
+      <w:pPr>
+        <w:keepNext w:val="0"/>
+        <w:widowControl/>
+        <w:spacing w:before="240" w:after="140"/>
+        <w:rPr>
+          <w:color w:val="000000" w:themeColor="text1"/>
+          <w:sz w:val="22"/>
+          <w:szCs w:val="22"/>
+        </w:rPr>
+      </w:pPr>
+      <w:r>
+        <w:rPr>
+          <w:b w:val="0"/>
+          <w:color w:val="000000" w:themeColor="text1"/>
+          <w:sz w:val="20"/>
+          <w:szCs w:val="22"/>
+        </w:rPr>
+        <w:t>[14] A. Ingle, “Crop Recommendation Dataset,” Kaggle, dataset landing page. https://www.kaggle.com/datasets/atharvaingle/crop-recommendation-dataset (accessed October 19, 2026).</w:t>
+      </w:r>
+    </w:p>
+    <w:p>
+      <w:pPr>
+        <w:keepNext w:val="0"/>
+        <w:widowControl/>
+        <w:spacing w:before="240" w:after="140"/>
+        <w:rPr>
+          <w:color w:val="000000" w:themeColor="text1"/>
+          <w:sz w:val="22"/>
+          <w:szCs w:val="22"/>
+        </w:rPr>
+      </w:pPr>
+      <w:r>
+        <w:rPr>
+          <w:b w:val="0"/>
+          <w:color w:val="000000" w:themeColor="text1"/>
+          <w:sz w:val="20"/>
+          <w:szCs w:val="22"/>
+        </w:rPr>
+        <w:t>[15] R. Chaudhary, SmartAgri, source repository, branch codex/dashboard-design, commit 42bb940a0102c4b141964a97dc49e9ccb60d3eb1, 2026. https://github.com/rizzit17/SmartAgri/tree/42bb940a0102c4b141964a97dc49e9ccb60d3eb1 (accessed October 25, 2026).</w:t>
+      </w:r>
+    </w:p>
+    <w:p>
+      <w:r>
+        <w:rPr>
+          <w:sz w:val="20"/>
+        </w:rPr>
+        <w:t xml:space="preserve">[16] R. Chaudhary, “Prog IoT Project Rishit 23BCT0157,” SmartAgri ESP32 Arduino simulation, Wokwi project 478323582523545601, 2026. </w:t>
       </w:r>
       <w:hyperlink r:id="rId24">
         <w:r>
@@ -18643,373 +16346,14 @@
         </w:r>
       </w:hyperlink>
       <w:r>
-        <w:t>. The saved project and its sketch/diagram were reopened and checked after the test session on October 25, 2026. Case protocols and selected results are given in Table 6a and Appendix B.</w:t>
-      </w:r>
-    </w:p>
-    <w:p>
-      <w:pPr>
-        <w:pStyle w:val="Heading1"/>
-        <w:keepNext/>
-        <w:widowControl/>
-        <w:spacing w:before="240" w:after="120"/>
-        <w:rPr>
-          <w:b/>
-          <w:bCs/>
-          <w:color w:val="000000" w:themeColor="text1"/>
-          <w:sz w:val="28"/>
-          <w:szCs w:val="28"/>
-        </w:rPr>
-      </w:pPr>
-      <w:r>
-        <w:rPr>
-          <w:b/>
-          <w:bCs/>
-          <w:color w:val="000000"/>
-          <w:sz w:val="28"/>
-          <w:szCs w:val="28"/>
-        </w:rPr>
-        <w:lastRenderedPageBreak/>
-        <w:t>References</w:t>
-      </w:r>
-    </w:p>
-    <w:p>
-      <w:pPr>
-        <w:keepNext w:val="0"/>
-        <w:widowControl/>
-        <w:spacing w:before="240" w:after="140"/>
-        <w:rPr>
-          <w:color w:val="000000" w:themeColor="text1"/>
-          <w:sz w:val="22"/>
-          <w:szCs w:val="22"/>
-        </w:rPr>
-      </w:pPr>
-      <w:r>
-        <w:rPr>
-          <w:b w:val="0"/>
-          <w:color w:val="000000" w:themeColor="text1"/>
+        <w:rPr>
           <w:sz w:val="20"/>
-          <w:szCs w:val="22"/>
-        </w:rPr>
-        <w:t>[1] K. G. Liakos, P. Busato, D. Moshou, S. Pearson, and D. Bochtis, “Machine Learning in Agriculture: A Review,” Sensors, vol. 18, no. 8, art. 2674, 2018. https://doi.org/10.3390/s18082674</w:t>
-      </w:r>
-    </w:p>
-    <w:p>
-      <w:pPr>
-        <w:keepNext w:val="0"/>
-        <w:widowControl/>
-        <w:spacing w:before="240" w:after="140"/>
-        <w:rPr>
-          <w:color w:val="000000" w:themeColor="text1"/>
-          <w:sz w:val="22"/>
-          <w:szCs w:val="22"/>
-        </w:rPr>
-      </w:pPr>
-      <w:r>
-        <w:rPr>
-          <w:b w:val="0"/>
-          <w:color w:val="000000" w:themeColor="text1"/>
-          <w:sz w:val="20"/>
-          <w:szCs w:val="22"/>
-        </w:rPr>
-        <w:t>[2] G. P. Pereira, M. Z. Chaari, and F. Daroge, “IoT-Enabled Smart Drip Irrigation System Using ESP32,” IoT, vol. 4, no. 3, pp. 221–243, 2023. https://doi.org/10.3390/iot4030012</w:t>
-      </w:r>
-    </w:p>
-    <w:p>
-      <w:pPr>
-        <w:keepNext w:val="0"/>
-        <w:widowControl/>
-        <w:spacing w:before="240" w:after="140"/>
-        <w:rPr>
-          <w:color w:val="000000" w:themeColor="text1"/>
-          <w:sz w:val="22"/>
-          <w:szCs w:val="22"/>
-        </w:rPr>
-      </w:pPr>
-      <w:r>
-        <w:rPr>
-          <w:b w:val="0"/>
-          <w:color w:val="000000" w:themeColor="text1"/>
-          <w:sz w:val="20"/>
-          <w:szCs w:val="22"/>
-        </w:rPr>
-        <w:t>[3] M. K. Senapaty, A. Ray, and N. Padhy, “A Decision Support System for Crop Recommendation Using Machine Learning Classification Algorithms,” Agriculture, vol. 14, no. 8, art. 1256, 2024. https://doi.org/10.3390/agriculture14081256</w:t>
-      </w:r>
-    </w:p>
-    <w:p>
-      <w:pPr>
-        <w:keepNext w:val="0"/>
-        <w:widowControl/>
-        <w:spacing w:before="240" w:after="140"/>
-        <w:rPr>
-          <w:color w:val="000000" w:themeColor="text1"/>
-          <w:sz w:val="22"/>
-          <w:szCs w:val="22"/>
-        </w:rPr>
-      </w:pPr>
-      <w:r>
-        <w:rPr>
-          <w:b w:val="0"/>
-          <w:color w:val="000000" w:themeColor="text1"/>
-          <w:sz w:val="20"/>
-          <w:szCs w:val="22"/>
-        </w:rPr>
-        <w:t>[4] P. Wijayakusuma, G. P. N. Hakim, and B. Li, “TerraGrow: Integrated platform for real time plant monitoring and automated watering system with IoT and fuzzy Sugeno Algorithm,” HardwareX, vol. 24, art. e00724, 2025. https://doi.org/10.1016/j.ohx.2025.e00724</w:t>
-      </w:r>
-    </w:p>
-    <w:p>
-      <w:pPr>
-        <w:keepNext w:val="0"/>
-        <w:widowControl/>
-        <w:spacing w:before="240" w:after="140"/>
-        <w:rPr>
-          <w:color w:val="000000" w:themeColor="text1"/>
-          <w:sz w:val="22"/>
-          <w:szCs w:val="22"/>
-        </w:rPr>
-      </w:pPr>
-      <w:r>
-        <w:rPr>
-          <w:b w:val="0"/>
-          <w:color w:val="000000" w:themeColor="text1"/>
-          <w:sz w:val="20"/>
-          <w:szCs w:val="22"/>
-        </w:rPr>
-        <w:t>[5] A. Cartolano, A. Cuzzocrea, and G. Pilato, “Analyzing and assessing explainable AI models for smart agriculture environments,” Multimedia Tools and Applications, vol. 83, no. 12, pp. 37225–37246, 2024. https://doi.org/10.1007/s11042-023-17978-z</w:t>
-      </w:r>
-    </w:p>
-    <w:p>
-      <w:pPr>
-        <w:keepNext w:val="0"/>
-        <w:widowControl/>
-        <w:spacing w:before="240" w:after="140"/>
-        <w:rPr>
-          <w:color w:val="000000" w:themeColor="text1"/>
-          <w:sz w:val="22"/>
-          <w:szCs w:val="22"/>
-        </w:rPr>
-      </w:pPr>
-      <w:r>
-        <w:rPr>
-          <w:b w:val="0"/>
-          <w:color w:val="000000" w:themeColor="text1"/>
-          <w:sz w:val="20"/>
-          <w:szCs w:val="22"/>
-        </w:rPr>
-        <w:t>[6] L. Breiman, “Random Forests,” Machine Learning, vol. 45, no. 1, pp. 5–32, 2001. https://doi.org/10.1023/A:1010933404324</w:t>
-      </w:r>
-    </w:p>
-    <w:p>
-      <w:pPr>
-        <w:keepNext w:val="0"/>
-        <w:widowControl/>
-        <w:spacing w:before="240" w:after="140"/>
-        <w:rPr>
-          <w:color w:val="000000" w:themeColor="text1"/>
-          <w:sz w:val="22"/>
-          <w:szCs w:val="22"/>
-        </w:rPr>
-      </w:pPr>
-      <w:r>
-        <w:rPr>
-          <w:b w:val="0"/>
-          <w:color w:val="000000" w:themeColor="text1"/>
-          <w:sz w:val="20"/>
-          <w:szCs w:val="22"/>
-        </w:rPr>
-        <w:t>[7] S. M. Lundberg and S.-I. Lee, “A Unified Approach to Interpreting Model Predictions,” Advances in Neural Information Processing Systems, vol. 30, pp. 4765–4774, 2017. https://proceedings.neurips.cc/paper/2017/hash/8a20a8621978632d76c43dfd28b67767-Abstract.html</w:t>
-      </w:r>
-    </w:p>
-    <w:p>
-      <w:pPr>
-        <w:keepNext w:val="0"/>
-        <w:widowControl/>
-        <w:spacing w:before="240" w:after="140"/>
-        <w:rPr>
-          <w:color w:val="000000" w:themeColor="text1"/>
-          <w:sz w:val="22"/>
-          <w:szCs w:val="22"/>
-        </w:rPr>
-      </w:pPr>
-      <w:r>
-        <w:rPr>
-          <w:b w:val="0"/>
-          <w:color w:val="000000" w:themeColor="text1"/>
-          <w:sz w:val="20"/>
-          <w:szCs w:val="22"/>
-        </w:rPr>
-        <w:t>[8] MathWorks, “Mamdani and Sugeno Fuzzy Inference Systems,” Fuzzy Logic Toolbox documentation. https://www.mathworks.com/help/fuzzy/types-of-fuzzy-inference-systems.html (accessed October 19, 2026).</w:t>
-      </w:r>
-    </w:p>
-    <w:p>
-      <w:pPr>
-        <w:keepNext w:val="0"/>
-        <w:widowControl/>
-        <w:spacing w:before="240" w:after="140"/>
-        <w:rPr>
-          <w:color w:val="000000" w:themeColor="text1"/>
-          <w:sz w:val="22"/>
-          <w:szCs w:val="22"/>
-        </w:rPr>
-      </w:pPr>
-      <w:r>
-        <w:rPr>
-          <w:b w:val="0"/>
-          <w:color w:val="000000" w:themeColor="text1"/>
-          <w:sz w:val="20"/>
-          <w:szCs w:val="22"/>
-        </w:rPr>
-        <w:t>[9] A. Banks and R. Gupta, Eds., MQTT Version 3.1.1, OASIS Standard, October 29, 2014. https://docs.oasis-open.org/mqtt/mqtt/v3.1.1/os/mqtt-v3.1.1-os.html</w:t>
-      </w:r>
-    </w:p>
-    <w:p>
-      <w:pPr>
-        <w:keepNext w:val="0"/>
-        <w:widowControl/>
-        <w:spacing w:before="240" w:after="140"/>
-        <w:rPr>
-          <w:color w:val="000000" w:themeColor="text1"/>
-          <w:sz w:val="22"/>
-          <w:szCs w:val="22"/>
-        </w:rPr>
-      </w:pPr>
-      <w:r>
-        <w:rPr>
-          <w:b w:val="0"/>
-          <w:color w:val="000000" w:themeColor="text1"/>
-          <w:sz w:val="20"/>
-          <w:szCs w:val="22"/>
-        </w:rPr>
-        <w:t>[10] Wokwi, “wokwi-dht22 Reference,” Wokwi Docs. https://docs.wokwi.com/parts/wokwi-dht22 (accessed October 19, 2026).</w:t>
-      </w:r>
-    </w:p>
-    <w:p>
-      <w:pPr>
-        <w:keepNext w:val="0"/>
-        <w:widowControl/>
-        <w:spacing w:before="240" w:after="140"/>
-        <w:rPr>
-          <w:color w:val="000000" w:themeColor="text1"/>
-          <w:sz w:val="22"/>
-          <w:szCs w:val="22"/>
-        </w:rPr>
-      </w:pPr>
-      <w:r>
-        <w:rPr>
-          <w:b w:val="0"/>
-          <w:color w:val="000000" w:themeColor="text1"/>
-          <w:sz w:val="20"/>
-          <w:szCs w:val="22"/>
-        </w:rPr>
-        <w:t>[11] Wokwi, “wokwi-ssd1306 Reference,” Wokwi Docs. https://docs.wokwi.com/parts/wokwi-ssd1306 (accessed October 19, 2026).</w:t>
-      </w:r>
-    </w:p>
-    <w:p>
-      <w:pPr>
-        <w:keepNext w:val="0"/>
-        <w:widowControl/>
-        <w:spacing w:before="240" w:after="140"/>
-        <w:rPr>
-          <w:color w:val="000000" w:themeColor="text1"/>
-          <w:sz w:val="22"/>
-          <w:szCs w:val="22"/>
-        </w:rPr>
-      </w:pPr>
-      <w:r>
-        <w:rPr>
-          <w:b w:val="0"/>
-          <w:color w:val="000000" w:themeColor="text1"/>
-          <w:sz w:val="20"/>
-          <w:szCs w:val="22"/>
-        </w:rPr>
-        <w:t>[12] Adafruit, “DHT11, DHT22 and AM2302 Sensors: Overview,” Adafruit Learning System. https://learn.adafruit.com/dht/overview (accessed October 19, 2026).</w:t>
-      </w:r>
-    </w:p>
-    <w:p>
-      <w:pPr>
-        <w:keepNext w:val="0"/>
-        <w:widowControl/>
-        <w:spacing w:before="240" w:after="140"/>
-        <w:rPr>
-          <w:color w:val="000000" w:themeColor="text1"/>
-          <w:sz w:val="22"/>
-          <w:szCs w:val="22"/>
-        </w:rPr>
-      </w:pPr>
-      <w:r>
-        <w:rPr>
-          <w:b w:val="0"/>
-          <w:color w:val="000000" w:themeColor="text1"/>
-          <w:sz w:val="20"/>
-          <w:szCs w:val="22"/>
-        </w:rPr>
-        <w:t>[13] scikit-learn developers, “Cross-validation: evaluating estimator performance,” scikit-learn User Guide. https://scikit-learn.org/stable/modules/cross_validation.html (accessed October 19, 2026).</w:t>
-      </w:r>
-    </w:p>
-    <w:p>
-      <w:pPr>
-        <w:keepNext w:val="0"/>
-        <w:widowControl/>
-        <w:spacing w:before="240" w:after="140"/>
-        <w:rPr>
-          <w:color w:val="000000" w:themeColor="text1"/>
-          <w:sz w:val="22"/>
-          <w:szCs w:val="22"/>
-        </w:rPr>
-      </w:pPr>
-      <w:r>
-        <w:rPr>
-          <w:b w:val="0"/>
-          <w:color w:val="000000" w:themeColor="text1"/>
-          <w:sz w:val="20"/>
-          <w:szCs w:val="22"/>
-        </w:rPr>
-        <w:t>[14] A. Ingle, “Crop Recommendation Dataset,” Kaggle, dataset landing page. https://www.kaggle.com/datasets/atharvaingle/crop-recommendation-dataset (accessed October 19, 2026).</w:t>
-      </w:r>
-    </w:p>
-    <w:p>
-      <w:pPr>
-        <w:keepNext w:val="0"/>
-        <w:widowControl/>
-        <w:spacing w:before="240" w:after="140"/>
-        <w:rPr>
-          <w:color w:val="000000" w:themeColor="text1"/>
-          <w:sz w:val="22"/>
-          <w:szCs w:val="22"/>
-        </w:rPr>
-      </w:pPr>
-      <w:r>
-        <w:rPr>
-          <w:b w:val="0"/>
-          <w:color w:val="000000" w:themeColor="text1"/>
-          <w:sz w:val="20"/>
-          <w:szCs w:val="22"/>
-        </w:rPr>
-        <w:t>[15] R. Chaudhary, SmartAgri, source repository, branch codex/dashboard-design, commit c74c049e1c3bd35b2e8d45fa087b26839b8c3107, 2026. https://github.com/rizzit17/SmartAgri/tree/c74c049e1c3bd35b2e8d45fa087b26839b8c3107 (accessed October 25, 2026).</w:t>
-      </w:r>
-    </w:p>
-    <w:p>
-      <w:r>
-        <w:rPr>
-          <w:sz w:val="20"/>
-        </w:rPr>
-        <w:t xml:space="preserve">[16] R. Chaudhary, “Prog IoT Project Rishit 23BCT0157,” SmartAgri ESP32 Arduino simulation, Wokwi project 478323582523545601, 2026. </w:t>
-      </w:r>
-      <w:hyperlink r:id="rId24">
-        <w:r>
-          <w:rPr>
-            <w:rStyle w:val="Hyperlink"/>
-          </w:rPr>
-          <w:t>https://wokwi.com/projects/478323582523545601</w:t>
-        </w:r>
-      </w:hyperlink>
-      <w:r>
-        <w:rPr>
-          <w:sz w:val="20"/>
         </w:rPr>
         <w:t xml:space="preserve"> (tested and accessed October 25, 2026).</w:t>
       </w:r>
     </w:p>
     <w:sectPr>
+      <w:type w:val="nextPage"/>
       <w:pgSz w:w="12240" w:h="15840"/>
       <w:pgMar w:top="1440" w:right="1440" w:bottom="1440" w:left="1440" w:header="708" w:footer="708" w:gutter="0"/>
       <w:cols w:space="720"/>

</xml_diff>

<commit_message>
Restore hardware photo and add paired Wokwi evidence in 25-page paper
</commit_message>
<xml_diff>
--- a/research/ProgIoT DA-7 Research Paper Rishit 23BCT0157.docx
+++ b/research/ProgIoT DA-7 Research Paper Rishit 23BCT0157.docx
@@ -1719,7 +1719,7 @@
           <w:sz w:val="22"/>
           <w:szCs w:val="22"/>
         </w:rPr>
-        <w:t>The architecture comprises an ESP32 sensing design, an MQTT collector and a Streamlit application, evaluated through two complementary simulation paths. The browser engine runs in Python and renders calculated state; Wokwi compiles and executes the Arduino ESP32 firmware against virtual circuit components. A physical DHT11/capacitive-probe assembly was built but did not supply the reported results. Figure 3 shows the tested Wokwi DHT22/potentiometer configuration. Both simulations use a five-second sample period and a five-sample moving average. The LED and GPIO output represent a pump command without hydraulic feedback.</w:t>
+        <w:t>The architecture comprises an ESP32 sensing design, an MQTT collector and a Streamlit application, evaluated through two complementary simulation paths. The browser engine runs in Python and renders calculated state; Wokwi compiles and executes the Arduino ESP32 firmware against virtual circuit components. A physical DHT11/capacitive-probe assembly was built but did not supply the reported results. Figure 3 documents the physical assembly; Figure 4 shows the tested Wokwi DHT22/potentiometer configuration. Both simulations use a five-second sample period and a five-sample moving average. The LED and GPIO output represent a pump command without hydraulic feedback.</w:t>
       </w:r>
     </w:p>
     <w:p>
@@ -2343,7 +2343,7 @@
               <w:rPr>
                 <w:sz w:val="18"/>
               </w:rPr>
-              <w:t>I²C in Figure 3</w:t>
+              <w:t>I²C in Figure 4</w:t>
             </w:r>
           </w:p>
         </w:tc>
@@ -2577,6 +2577,59 @@
           <w:szCs w:val="22"/>
         </w:rPr>
         <w:t>The tested Wokwi circuit uses an SSD1306 I2C display at address 0x3C, with SDA GPIO 21 and SCL GPIO 22, consistent with the documented interface [11]. Its four project files are sketch.ino, controller.h, diagram.json and libraries.txt. The sketch compiled and ran successfully in Wokwi; a fresh project view after saving matched the tested sketch and diagram. OLED refresh can appear dithered in paused screenshots, so numerical decisions are reported using Serial and archived telemetry.</w:t>
+      </w:r>
+    </w:p>
+    <w:p>
+      <w:pPr>
+        <w:keepNext/>
+        <w:spacing w:after="60" w:before="0" w:line="240" w:lineRule="auto"/>
+        <w:jc w:val="center"/>
+      </w:pPr>
+      <w:r>
+        <w:drawing>
+          <wp:inline xmlns:a="http://schemas.openxmlformats.org/drawingml/2006/main" xmlns:pic="http://schemas.openxmlformats.org/drawingml/2006/picture">
+            <wp:extent cx="2666102" cy="3063240"/>
+            <wp:docPr id="1570744402" name="Picture 1570744402"/>
+            <wp:cNvGraphicFramePr>
+              <a:graphicFrameLocks noChangeAspect="1"/>
+            </wp:cNvGraphicFramePr>
+            <a:graphic>
+              <a:graphicData uri="http://schemas.openxmlformats.org/drawingml/2006/picture">
+                <pic:pic>
+                  <pic:nvPicPr>
+                    <pic:cNvPr id="0" name="image3.jpeg"/>
+                    <pic:cNvPicPr/>
+                  </pic:nvPicPr>
+                  <pic:blipFill>
+                    <a:blip r:embed="rId5"/>
+                    <a:stretch>
+                      <a:fillRect/>
+                    </a:stretch>
+                  </pic:blipFill>
+                  <pic:spPr>
+                    <a:xfrm>
+                      <a:off x="0" y="0"/>
+                      <a:ext cx="2666102" cy="3063240"/>
+                    </a:xfrm>
+                    <a:prstGeom prst="rect"/>
+                  </pic:spPr>
+                </pic:pic>
+              </a:graphicData>
+            </a:graphic>
+          </wp:inline>
+        </w:drawing>
+      </w:r>
+    </w:p>
+    <w:p>
+      <w:pPr>
+        <w:spacing w:after="60" w:before="0" w:line="240" w:lineRule="auto"/>
+        <w:jc w:val="center"/>
+      </w:pPr>
+      <w:r>
+        <w:rPr>
+          <w:sz w:val="18"/>
+        </w:rPr>
+        <w:t>Figure 3: Physical DHT11 and capacitive-probe breadboard prototype. This assembly was built for the project but did not supply the reported experimental results.</w:t>
       </w:r>
     </w:p>
     <w:p>
@@ -5556,7 +5609,7 @@
           <w:sz w:val="22"/>
           <w:szCs w:val="22"/>
         </w:rPr>
-        <w:t>Two experiments are distinguished. The browser experiment executes nine deterministic scenarios, each for 120 software seconds with seed 7, five-second samples and one-second state/fault ticks. Wokwi executes 18 prescribed functional scenarios through the saved ESP32 firmware [16]. CASE commands reset the filter and pending dose; STEP preserves existing filter and dose history. The original firmware suite shares one boot, with later TC18 framing repeats counted once. The LIVE demonstration reads the Wokwi sensor models. These are functional observations, not independent field replications. Figure 3 shows a representative Wokwi circuit-and-Serial state; Appendix B retains two browser views. The companion supplementary document provides the complete screenshot evidence and per-case reproduction commands.</w:t>
+        <w:t>Two experiments are distinguished. The browser experiment executes nine deterministic scenarios, each for 120 software seconds with seed 7, five-second samples and one-second state/fault ticks. Wokwi executes 18 prescribed functional scenarios through the saved ESP32 firmware [16]. CASE commands reset the filter and pending dose; STEP preserves existing filter and dose history. The original firmware suite shares one boot, with later TC18 framing repeats counted once. The LIVE demonstration reads the Wokwi sensor models. These are functional observations, not independent field replications. Figure 4 shows a representative Wokwi state; Appendix B contains browser examples and six paired Wokwi captures. The companion supplement provides all screenshot evidence and reproduction commands.</w:t>
       </w:r>
     </w:p>
     <w:p>
@@ -5626,7 +5679,7 @@
           <w:sz w:val="20"/>
           <w:szCs w:val="21"/>
         </w:rPr>
-        <w:t>Figure 3: Tested Wokwi Circuit and Serial Monitor at Normal Input with an 8-Minute Command and GPIO2 HIGH</w:t>
+        <w:t>Figure 4: Tested Wokwi Circuit and Serial Monitor at Normal Input with an 8-Minute Command and GPIO2 HIGH</w:t>
       </w:r>
     </w:p>
     <w:p>
@@ -15562,24 +15615,26 @@
     </w:p>
     <w:p>
       <w:pPr>
-        <w:spacing w:after="100"/>
-      </w:pPr>
-      <w:r>
-        <w:t>Figures 4 and 5 illustrate a controller-policy difference and the distinction between a nonzero fuzzy command and gated pump output. Inputs are prescribed, timers are accelerated and the LED represents logical actuation. Complete browser screenshots and all Wokwi case captures are supplied in the companion supplementary document, SmartAgri Wokwi Simulation Test Cases. Tables 6 and 6a retain the full numeric case summaries in this paper.</w:t>
+        <w:spacing w:after="60" w:before="0" w:line="240" w:lineRule="auto"/>
+      </w:pPr>
+      <w:r>
+        <w:rPr>
+          <w:sz w:val="18"/>
+        </w:rPr>
+        <w:t>Figures 5–6 retain the browser policy and safety examples. Figures 7–12 provide six representative Wokwi circuit-and-Serial captures across three pages, with two captures per page. All inputs are synthetic and output timers are accelerated. Complete case records remain in the companion simulation supplement.</w:t>
       </w:r>
     </w:p>
     <w:p>
       <w:pPr>
         <w:keepNext/>
-        <w:spacing w:after="140"/>
+        <w:spacing w:after="60" w:before="0" w:line="240" w:lineRule="auto"/>
         <w:jc w:val="center"/>
-        <w:keepNext/>
       </w:pPr>
       <w:r>
         <w:drawing>
           <wp:inline xmlns:a="http://schemas.openxmlformats.org/drawingml/2006/main" xmlns:pic="http://schemas.openxmlformats.org/drawingml/2006/picture">
-            <wp:extent cx="5943600" cy="4285053"/>
-            <wp:docPr id="1570744389" name="Picture 1570744389" descr="Dry and hot synthetic inputs produce a 40-minute fuzzy command and a 10-minute threshold-reference command."/>
+            <wp:extent cx="4480560" cy="3230270"/>
+            <wp:docPr id="1570744403" name="Picture 1570744403"/>
             <wp:cNvGraphicFramePr>
               <a:graphicFrameLocks noChangeAspect="1"/>
             </wp:cNvGraphicFramePr>
@@ -15587,7 +15642,7 @@
               <a:graphicData uri="http://schemas.openxmlformats.org/drawingml/2006/picture">
                 <pic:pic>
                   <pic:nvPicPr>
-                    <pic:cNvPr id="0" name="paper-dry-hot.jpg"/>
+                    <pic:cNvPr id="0" name="image.jpg"/>
                     <pic:cNvPicPr/>
                   </pic:nvPicPr>
                   <pic:blipFill>
@@ -15599,7 +15654,7 @@
                   <pic:spPr>
                     <a:xfrm>
                       <a:off x="0" y="0"/>
-                      <a:ext cx="5943600" cy="4285053"/>
+                      <a:ext cx="4480560" cy="3230270"/>
                     </a:xfrm>
                     <a:prstGeom prst="rect"/>
                   </pic:spPr>
@@ -15612,39 +15667,27 @@
     </w:p>
     <w:p>
       <w:pPr>
+        <w:spacing w:after="60" w:before="0" w:line="240" w:lineRule="auto"/>
+        <w:jc w:val="center"/>
+      </w:pPr>
+      <w:r>
+        <w:rPr>
+          <w:sz w:val="18"/>
+        </w:rPr>
+        <w:t>Figure 5: Hot and dry browser input: fuzzy command 40 min versus reference 10 min.</w:t>
+      </w:r>
+    </w:p>
+    <w:p>
+      <w:pPr>
         <w:keepNext/>
-        <w:spacing w:after="100"/>
-      </w:pPr>
-      <w:r>
-        <w:rPr>
-          <w:sz w:val="18"/>
-        </w:rPr>
-        <w:t>Figure 4: Dry and hot synthetic inputs produce a 40-minute fuzzy command and a 10-minute threshold-reference command.</w:t>
-      </w:r>
-    </w:p>
-    <w:p>
-      <w:pPr>
-        <w:spacing w:after="100"/>
-      </w:pPr>
-      <w:r>
-        <w:rPr>
-          <w:sz w:val="18"/>
-        </w:rPr>
-        <w:t>Replay context: 0 / 120 s. Saved run: 20261024T190206689673Z-9a66375e. Raw trace and settings accompany the paper.</w:t>
-      </w:r>
-    </w:p>
-    <w:p>
-      <w:pPr>
-        <w:keepNext/>
-        <w:spacing w:after="140"/>
+        <w:spacing w:after="60" w:before="0" w:line="240" w:lineRule="auto"/>
         <w:jc w:val="center"/>
-        <w:keepNext/>
       </w:pPr>
       <w:r>
         <w:drawing>
           <wp:inline xmlns:a="http://schemas.openxmlformats.org/drawingml/2006/main" xmlns:pic="http://schemas.openxmlformats.org/drawingml/2006/picture">
-            <wp:extent cx="5943600" cy="4285053"/>
-            <wp:docPr id="1570744392" name="Picture 1570744392" descr="At 15 s raw moisture rises to 90%, while the moving average is 30%. The safety gate stops the pump despite a nonzero 34-minute fuzzy command."/>
+            <wp:extent cx="4480560" cy="3230270"/>
+            <wp:docPr id="1570744404" name="Picture 1570744404"/>
             <wp:cNvGraphicFramePr>
               <a:graphicFrameLocks noChangeAspect="1"/>
             </wp:cNvGraphicFramePr>
@@ -15652,7 +15695,7 @@
               <a:graphicData uri="http://schemas.openxmlformats.org/drawingml/2006/picture">
                 <pic:pic>
                   <pic:nvPicPr>
-                    <pic:cNvPr id="0" name="paper-wet-stop.jpg"/>
+                    <pic:cNvPr id="0" name="image.jpg"/>
                     <pic:cNvPicPr/>
                   </pic:nvPicPr>
                   <pic:blipFill>
@@ -15664,7 +15707,7 @@
                   <pic:spPr>
                     <a:xfrm>
                       <a:off x="0" y="0"/>
-                      <a:ext cx="5943600" cy="4285053"/>
+                      <a:ext cx="4480560" cy="3230270"/>
                     </a:xfrm>
                     <a:prstGeom prst="rect"/>
                   </pic:spPr>
@@ -15677,25 +15720,371 @@
     </w:p>
     <w:p>
       <w:pPr>
+        <w:spacing w:after="60" w:before="0" w:line="240" w:lineRule="auto"/>
+        <w:jc w:val="center"/>
+      </w:pPr>
+      <w:r>
+        <w:rPr>
+          <w:sz w:val="18"/>
+        </w:rPr>
+        <w:t>Figure 6: Browser wet step at 15 s: raw moisture 90%, average 30%, fuzzy command 34 min and pump OFF due to the raw-wet gate.</w:t>
+      </w:r>
+    </w:p>
+    <w:p>
+      <w:pPr>
+        <w:pageBreakBefore/>
+        <w:spacing w:after="60" w:before="0" w:line="240" w:lineRule="auto"/>
+      </w:pPr>
+      <w:r>
+        <w:rPr>
+          <w:b/>
+          <w:sz w:val="20"/>
+        </w:rPr>
+        <w:t>Wokwi circuit and Serial evidence 1 of 3</w:t>
+      </w:r>
+    </w:p>
+    <w:p>
+      <w:pPr>
         <w:keepNext/>
-        <w:spacing w:after="100"/>
-      </w:pPr>
-      <w:r>
-        <w:rPr>
-          <w:sz w:val="18"/>
-        </w:rPr>
-        <w:t>Figure 5: At 15 s raw moisture rises to 90%, while the moving average is 30%. The safety gate stops the pump despite a nonzero 34-minute fuzzy command.</w:t>
-      </w:r>
-    </w:p>
-    <w:p>
-      <w:pPr>
-        <w:spacing w:after="100"/>
-      </w:pPr>
-      <w:r>
-        <w:rPr>
-          <w:sz w:val="18"/>
-        </w:rPr>
-        <w:t>Replay context: 15 / 120 s. Saved run: 20261024T190224597554Z-1e1fe932. Raw trace and settings accompany the paper.</w:t>
+        <w:spacing w:after="60" w:before="0" w:line="240" w:lineRule="auto"/>
+        <w:jc w:val="center"/>
+      </w:pPr>
+      <w:r>
+        <w:drawing>
+          <wp:inline xmlns:a="http://schemas.openxmlformats.org/drawingml/2006/main" xmlns:pic="http://schemas.openxmlformats.org/drawingml/2006/picture">
+            <wp:extent cx="5486400" cy="2624306"/>
+            <wp:docPr id="1570744405" name="Picture 1570744405"/>
+            <wp:cNvGraphicFramePr>
+              <a:graphicFrameLocks noChangeAspect="1"/>
+            </wp:cNvGraphicFramePr>
+            <a:graphic>
+              <a:graphicData uri="http://schemas.openxmlformats.org/drawingml/2006/picture">
+                <pic:pic>
+                  <pic:nvPicPr>
+                    <pic:cNvPr id="0" name="TC03-hot-dry-maximum-command.jpg"/>
+                    <pic:cNvPicPr/>
+                  </pic:nvPicPr>
+                  <pic:blipFill>
+                    <a:blip r:embed="rId6"/>
+                    <a:stretch>
+                      <a:fillRect/>
+                    </a:stretch>
+                  </pic:blipFill>
+                  <pic:spPr>
+                    <a:xfrm>
+                      <a:off x="0" y="0"/>
+                      <a:ext cx="5486400" cy="2624306"/>
+                    </a:xfrm>
+                    <a:prstGeom prst="rect"/>
+                  </pic:spPr>
+                </pic:pic>
+              </a:graphicData>
+            </a:graphic>
+          </wp:inline>
+        </w:drawing>
+      </w:r>
+    </w:p>
+    <w:p>
+      <w:pPr>
+        <w:spacing w:after="60" w:before="0" w:line="240" w:lineRule="auto"/>
+        <w:jc w:val="center"/>
+      </w:pPr>
+      <w:r>
+        <w:rPr>
+          <w:sz w:val="16"/>
+        </w:rPr>
+        <w:t>Figure 7: W-03. Hot, dry soil: maximum 40 min command; alert and pump ON. Command 40 min; pump ON; GPIO2 HIGH; MQTT ON. PASS.</w:t>
+      </w:r>
+    </w:p>
+    <w:p>
+      <w:pPr>
+        <w:keepNext/>
+        <w:spacing w:after="60" w:before="0" w:line="240" w:lineRule="auto"/>
+        <w:jc w:val="center"/>
+      </w:pPr>
+      <w:r>
+        <w:drawing>
+          <wp:inline xmlns:a="http://schemas.openxmlformats.org/drawingml/2006/main" xmlns:pic="http://schemas.openxmlformats.org/drawingml/2006/picture">
+            <wp:extent cx="5486400" cy="2624306"/>
+            <wp:docPr id="1570744406" name="Picture 1570744406"/>
+            <wp:cNvGraphicFramePr>
+              <a:graphicFrameLocks noChangeAspect="1"/>
+            </wp:cNvGraphicFramePr>
+            <a:graphic>
+              <a:graphicData uri="http://schemas.openxmlformats.org/drawingml/2006/picture">
+                <pic:pic>
+                  <pic:nvPicPr>
+                    <pic:cNvPr id="0" name="TC09-fault-during-active-dose-stops-gpio.jpg"/>
+                    <pic:cNvPicPr/>
+                  </pic:nvPicPr>
+                  <pic:blipFill>
+                    <a:blip r:embed="rId7"/>
+                    <a:stretch>
+                      <a:fillRect/>
+                    </a:stretch>
+                  </pic:blipFill>
+                  <pic:spPr>
+                    <a:xfrm>
+                      <a:off x="0" y="0"/>
+                      <a:ext cx="5486400" cy="2624306"/>
+                    </a:xfrm>
+                    <a:prstGeom prst="rect"/>
+                  </pic:spPr>
+                </pic:pic>
+              </a:graphicData>
+            </a:graphic>
+          </wp:inline>
+        </w:drawing>
+      </w:r>
+    </w:p>
+    <w:p>
+      <w:pPr>
+        <w:spacing w:after="60" w:before="0" w:line="240" w:lineRule="auto"/>
+        <w:jc w:val="center"/>
+      </w:pPr>
+      <w:r>
+        <w:rPr>
+          <w:sz w:val="16"/>
+        </w:rPr>
+        <w:t>Figure 8: W-09. Injected sensor fault stops the active pump; sensor FAULT; command zero. Command 0 min; pump OFF; GPIO2 LOW; MQTT ON. PASS.</w:t>
+      </w:r>
+    </w:p>
+    <w:p>
+      <w:pPr>
+        <w:pageBreakBefore/>
+        <w:spacing w:after="60" w:before="0" w:line="240" w:lineRule="auto"/>
+      </w:pPr>
+      <w:r>
+        <w:rPr>
+          <w:b/>
+          <w:sz w:val="20"/>
+        </w:rPr>
+        <w:t>Wokwi circuit and Serial evidence 2 of 3</w:t>
+      </w:r>
+    </w:p>
+    <w:p>
+      <w:pPr>
+        <w:keepNext/>
+        <w:spacing w:after="60" w:before="0" w:line="240" w:lineRule="auto"/>
+        <w:jc w:val="center"/>
+      </w:pPr>
+      <w:r>
+        <w:drawing>
+          <wp:inline xmlns:a="http://schemas.openxmlformats.org/drawingml/2006/main" xmlns:pic="http://schemas.openxmlformats.org/drawingml/2006/picture">
+            <wp:extent cx="5486400" cy="2624306"/>
+            <wp:docPr id="1570744407" name="Picture 1570744407"/>
+            <wp:cNvGraphicFramePr>
+              <a:graphicFrameLocks noChangeAspect="1"/>
+            </wp:cNvGraphicFramePr>
+            <a:graphic>
+              <a:graphicData uri="http://schemas.openxmlformats.org/drawingml/2006/picture">
+                <pic:pic>
+                  <pic:nvPicPr>
+                    <pic:cNvPr id="0" name="TC10-valid-recovery-resets-filter.jpg"/>
+                    <pic:cNvPicPr/>
+                  </pic:nvPicPr>
+                  <pic:blipFill>
+                    <a:blip r:embed="rId8"/>
+                    <a:stretch>
+                      <a:fillRect/>
+                    </a:stretch>
+                  </pic:blipFill>
+                  <pic:spPr>
+                    <a:xfrm>
+                      <a:off x="0" y="0"/>
+                      <a:ext cx="5486400" cy="2624306"/>
+                    </a:xfrm>
+                    <a:prstGeom prst="rect"/>
+                  </pic:spPr>
+                </pic:pic>
+              </a:graphicData>
+            </a:graphic>
+          </wp:inline>
+        </w:drawing>
+      </w:r>
+    </w:p>
+    <w:p>
+      <w:pPr>
+        <w:spacing w:after="60" w:before="0" w:line="240" w:lineRule="auto"/>
+        <w:jc w:val="center"/>
+      </w:pPr>
+      <w:r>
+        <w:rPr>
+          <w:sz w:val="16"/>
+        </w:rPr>
+        <w:t>Figure 9: W-10. Recovery clears injected fault and produces valid 8 min command. Command 8 min; pump ON; GPIO2 HIGH; MQTT ON. PASS.</w:t>
+      </w:r>
+    </w:p>
+    <w:p>
+      <w:pPr>
+        <w:keepNext/>
+        <w:spacing w:after="60" w:before="0" w:line="240" w:lineRule="auto"/>
+        <w:jc w:val="center"/>
+      </w:pPr>
+      <w:r>
+        <w:drawing>
+          <wp:inline xmlns:a="http://schemas.openxmlformats.org/drawingml/2006/main" xmlns:pic="http://schemas.openxmlformats.org/drawingml/2006/picture">
+            <wp:extent cx="5486400" cy="2624306"/>
+            <wp:docPr id="1570744408" name="Picture 1570744408"/>
+            <wp:cNvGraphicFramePr>
+              <a:graphicFrameLocks noChangeAspect="1"/>
+            </wp:cNvGraphicFramePr>
+            <a:graphic>
+              <a:graphicData uri="http://schemas.openxmlformats.org/drawingml/2006/picture">
+                <pic:pic>
+                  <pic:nvPicPr>
+                    <pic:cNvPr id="0" name="TC11-offline-timer-completes-without-broker.jpg"/>
+                    <pic:cNvPicPr/>
+                  </pic:nvPicPr>
+                  <pic:blipFill>
+                    <a:blip r:embed="rId9"/>
+                    <a:stretch>
+                      <a:fillRect/>
+                    </a:stretch>
+                  </pic:blipFill>
+                  <pic:spPr>
+                    <a:xfrm>
+                      <a:off x="0" y="0"/>
+                      <a:ext cx="5486400" cy="2624306"/>
+                    </a:xfrm>
+                    <a:prstGeom prst="rect"/>
+                  </pic:spPr>
+                </pic:pic>
+              </a:graphicData>
+            </a:graphic>
+          </wp:inline>
+        </w:drawing>
+      </w:r>
+    </w:p>
+    <w:p>
+      <w:pPr>
+        <w:spacing w:after="60" w:before="0" w:line="240" w:lineRule="auto"/>
+        <w:jc w:val="center"/>
+      </w:pPr>
+      <w:r>
+        <w:rPr>
+          <w:sz w:val="16"/>
+        </w:rPr>
+        <w:t>Figure 10: W-11. Local 8-second accelerated dose completes while MQTT is OFF. Command 8 min; pump OFF; GPIO2 LOW; MQTT OFF. PASS.</w:t>
+      </w:r>
+    </w:p>
+    <w:p>
+      <w:pPr>
+        <w:pageBreakBefore/>
+        <w:spacing w:after="60" w:before="0" w:line="240" w:lineRule="auto"/>
+      </w:pPr>
+      <w:r>
+        <w:rPr>
+          <w:b/>
+          <w:sz w:val="20"/>
+        </w:rPr>
+        <w:t>Wokwi circuit and Serial evidence 3 of 3</w:t>
+      </w:r>
+    </w:p>
+    <w:p>
+      <w:pPr>
+        <w:keepNext/>
+        <w:spacing w:after="60" w:before="0" w:line="240" w:lineRule="auto"/>
+        <w:jc w:val="center"/>
+      </w:pPr>
+      <w:r>
+        <w:drawing>
+          <wp:inline xmlns:a="http://schemas.openxmlformats.org/drawingml/2006/main" xmlns:pic="http://schemas.openxmlformats.org/drawingml/2006/picture">
+            <wp:extent cx="5486400" cy="2624306"/>
+            <wp:docPr id="1570744409" name="Picture 1570744409"/>
+            <wp:cNvGraphicFramePr>
+              <a:graphicFrameLocks noChangeAspect="1"/>
+            </wp:cNvGraphicFramePr>
+            <a:graphic>
+              <a:graphicData uri="http://schemas.openxmlformats.org/drawingml/2006/picture">
+                <pic:pic>
+                  <pic:nvPicPr>
+                    <pic:cNvPr id="0" name="TC12-mqtt-reconnect-and-receiver-resumes.jpg"/>
+                    <pic:cNvPicPr/>
+                  </pic:nvPicPr>
+                  <pic:blipFill>
+                    <a:blip r:embed="rId10"/>
+                    <a:stretch>
+                      <a:fillRect/>
+                    </a:stretch>
+                  </pic:blipFill>
+                  <pic:spPr>
+                    <a:xfrm>
+                      <a:off x="0" y="0"/>
+                      <a:ext cx="5486400" cy="2624306"/>
+                    </a:xfrm>
+                    <a:prstGeom prst="rect"/>
+                  </pic:spPr>
+                </pic:pic>
+              </a:graphicData>
+            </a:graphic>
+          </wp:inline>
+        </w:drawing>
+      </w:r>
+    </w:p>
+    <w:p>
+      <w:pPr>
+        <w:spacing w:after="60" w:before="0" w:line="240" w:lineRule="auto"/>
+        <w:jc w:val="center"/>
+      </w:pPr>
+      <w:r>
+        <w:rPr>
+          <w:sz w:val="16"/>
+        </w:rPr>
+        <w:t>Figure 11: W-12. Broker reconnects; receiver resumes receiving snapshots. Command 8 min; pump OFF; GPIO2 LOW; MQTT ON. PASS.</w:t>
+      </w:r>
+    </w:p>
+    <w:p>
+      <w:pPr>
+        <w:keepNext/>
+        <w:spacing w:after="60" w:before="0" w:line="240" w:lineRule="auto"/>
+        <w:jc w:val="center"/>
+      </w:pPr>
+      <w:r>
+        <w:drawing>
+          <wp:inline xmlns:a="http://schemas.openxmlformats.org/drawingml/2006/main" xmlns:pic="http://schemas.openxmlformats.org/drawingml/2006/picture">
+            <wp:extent cx="5486400" cy="2624306"/>
+            <wp:docPr id="1570744410" name="Picture 1570744410"/>
+            <wp:cNvGraphicFramePr>
+              <a:graphicFrameLocks noChangeAspect="1"/>
+            </wp:cNvGraphicFramePr>
+            <a:graphic>
+              <a:graphicData uri="http://schemas.openxmlformats.org/drawingml/2006/picture">
+                <pic:pic>
+                  <pic:nvPicPr>
+                    <pic:cNvPr id="0" name="TC18-filter-settles-after-five-samples.jpg"/>
+                    <pic:cNvPicPr/>
+                  </pic:nvPicPr>
+                  <pic:blipFill>
+                    <a:blip r:embed="rId13"/>
+                    <a:stretch>
+                      <a:fillRect/>
+                    </a:stretch>
+                  </pic:blipFill>
+                  <pic:spPr>
+                    <a:xfrm>
+                      <a:off x="0" y="0"/>
+                      <a:ext cx="5486400" cy="2624306"/>
+                    </a:xfrm>
+                    <a:prstGeom prst="rect"/>
+                  </pic:spPr>
+                </pic:pic>
+              </a:graphicData>
+            </a:graphic>
+          </wp:inline>
+        </w:drawing>
+      </w:r>
+    </w:p>
+    <w:p>
+      <w:pPr>
+        <w:spacing w:after="60" w:before="0" w:line="240" w:lineRule="auto"/>
+        <w:jc w:val="center"/>
+      </w:pPr>
+      <w:r>
+        <w:rPr>
+          <w:sz w:val="16"/>
+        </w:rPr>
+        <w:t>Figure 12: W-18. Five-sample response: 80, 60, 40, 20, 0%; settled command 26 min. Pump remains OFF until a new dose window. Command 26 min; pump OFF; GPIO2 LOW; MQTT ON. PASS.</w:t>
       </w:r>
     </w:p>
     <w:p>

</xml_diff>